<commit_message>
Expediente Word con imágenes embebidas de cada documento del checklist
</commit_message>
<xml_diff>
--- a/Expediente-Demanda-FORO7-2026-001.docx
+++ b/Expediente-Demanda-FORO7-2026-001.docx
@@ -72,7 +72,7 @@
     </w:p>
     <w:p>
       <w:pPr>
-        <w:spacing w:after="500"/>
+        <w:spacing w:after="400"/>
         <w:jc w:val="center"/>
       </w:pPr>
       <w:r>
@@ -103,7 +103,7 @@
     </w:p>
     <w:p>
       <w:pPr>
-        <w:spacing w:after="500"/>
+        <w:spacing w:after="400"/>
         <w:jc w:val="center"/>
       </w:pPr>
       <w:r>
@@ -119,20 +119,7 @@
     </w:p>
     <w:p>
       <w:pPr>
-        <w:spacing w:after="120"/>
-        <w:jc w:val="center"/>
-      </w:pPr>
-      <w:r>
-        <w:rPr>
-          <w:sz w:val="22"/>
-          <w:szCs w:val="22"/>
-        </w:rPr>
-        <w:t xml:space="preserve">Equipo dañado: DJI Osmo Pocket 3 | Serie: 5WTZM9C002CVXL</w:t>
-      </w:r>
-    </w:p>
-    <w:p>
-      <w:pPr>
-        <w:spacing w:after="500"/>
+        <w:spacing w:after="400"/>
         <w:jc w:val="center"/>
       </w:pPr>
       <w:r>
@@ -140,8 +127,8 @@
           <w:b/>
           <w:bCs/>
           <w:color w:val="cc2200"/>
-          <w:sz w:val="28"/>
-          <w:szCs w:val="28"/>
+          <w:sz w:val="30"/>
+          <w:szCs w:val="30"/>
         </w:rPr>
         <w:t xml:space="preserve">Monto reclamado: $30,699.00 MXN</w:t>
       </w:r>
@@ -186,7 +173,7 @@
         <w:pBdr>
           <w:bottom w:val="single" w:color="1a3a5c" w:sz="6"/>
         </w:pBdr>
-        <w:spacing w:after="200" w:before="400"/>
+        <w:spacing w:after="180" w:before="400"/>
       </w:pPr>
       <w:r>
         <w:rPr>
@@ -225,8 +212,8 @@
               <w:rPr>
                 <w:b/>
                 <w:bCs/>
-                <w:sz w:val="24"/>
-                <w:szCs w:val="24"/>
+                <w:sz w:val="22"/>
+                <w:szCs w:val="22"/>
               </w:rPr>
               <w:t xml:space="preserve">Caso No.</w:t>
             </w:r>
@@ -257,8 +244,8 @@
               <w:rPr>
                 <w:b/>
                 <w:bCs/>
-                <w:sz w:val="24"/>
-                <w:szCs w:val="24"/>
+                <w:sz w:val="22"/>
+                <w:szCs w:val="22"/>
               </w:rPr>
               <w:t xml:space="preserve">Afectado</w:t>
             </w:r>
@@ -289,8 +276,8 @@
               <w:rPr>
                 <w:b/>
                 <w:bCs/>
-                <w:sz w:val="24"/>
-                <w:szCs w:val="24"/>
+                <w:sz w:val="22"/>
+                <w:szCs w:val="22"/>
               </w:rPr>
               <w:t xml:space="preserve">WhatsApp</w:t>
             </w:r>
@@ -321,8 +308,8 @@
               <w:rPr>
                 <w:b/>
                 <w:bCs/>
-                <w:sz w:val="24"/>
-                <w:szCs w:val="24"/>
+                <w:sz w:val="22"/>
+                <w:szCs w:val="22"/>
               </w:rPr>
               <w:t xml:space="preserve">Correo</w:t>
             </w:r>
@@ -353,8 +340,8 @@
               <w:rPr>
                 <w:b/>
                 <w:bCs/>
-                <w:sz w:val="24"/>
-                <w:szCs w:val="24"/>
+                <w:sz w:val="22"/>
+                <w:szCs w:val="22"/>
               </w:rPr>
               <w:t xml:space="preserve">Demandado</w:t>
             </w:r>
@@ -385,8 +372,8 @@
               <w:rPr>
                 <w:b/>
                 <w:bCs/>
-                <w:sz w:val="24"/>
-                <w:szCs w:val="24"/>
+                <w:sz w:val="22"/>
+                <w:szCs w:val="22"/>
               </w:rPr>
               <w:t xml:space="preserve">Representante salón</w:t>
             </w:r>
@@ -417,8 +404,8 @@
               <w:rPr>
                 <w:b/>
                 <w:bCs/>
-                <w:sz w:val="24"/>
-                <w:szCs w:val="24"/>
+                <w:sz w:val="22"/>
+                <w:szCs w:val="22"/>
               </w:rPr>
               <w:t xml:space="preserve">Tel. salón</w:t>
             </w:r>
@@ -449,8 +436,8 @@
               <w:rPr>
                 <w:b/>
                 <w:bCs/>
-                <w:sz w:val="24"/>
-                <w:szCs w:val="24"/>
+                <w:sz w:val="22"/>
+                <w:szCs w:val="22"/>
               </w:rPr>
               <w:t xml:space="preserve">Correo salón</w:t>
             </w:r>
@@ -481,8 +468,8 @@
               <w:rPr>
                 <w:b/>
                 <w:bCs/>
-                <w:sz w:val="24"/>
-                <w:szCs w:val="24"/>
+                <w:sz w:val="22"/>
+                <w:szCs w:val="22"/>
               </w:rPr>
               <w:t xml:space="preserve">Domicilio salón</w:t>
             </w:r>
@@ -513,8 +500,8 @@
               <w:rPr>
                 <w:b/>
                 <w:bCs/>
-                <w:sz w:val="24"/>
-                <w:szCs w:val="24"/>
+                <w:sz w:val="22"/>
+                <w:szCs w:val="22"/>
               </w:rPr>
               <w:t xml:space="preserve">Fecha del evento</w:t>
             </w:r>
@@ -545,8 +532,8 @@
               <w:rPr>
                 <w:b/>
                 <w:bCs/>
-                <w:sz w:val="24"/>
-                <w:szCs w:val="24"/>
+                <w:sz w:val="22"/>
+                <w:szCs w:val="22"/>
               </w:rPr>
               <w:t xml:space="preserve">Evento</w:t>
             </w:r>
@@ -577,8 +564,8 @@
               <w:rPr>
                 <w:b/>
                 <w:bCs/>
-                <w:sz w:val="24"/>
-                <w:szCs w:val="24"/>
+                <w:sz w:val="22"/>
+                <w:szCs w:val="22"/>
               </w:rPr>
               <w:t xml:space="preserve">Equipo dañado</w:t>
             </w:r>
@@ -609,8 +596,8 @@
               <w:rPr>
                 <w:b/>
                 <w:bCs/>
-                <w:sz w:val="24"/>
-                <w:szCs w:val="24"/>
+                <w:sz w:val="22"/>
+                <w:szCs w:val="22"/>
               </w:rPr>
               <w:t xml:space="preserve">No. de serie</w:t>
             </w:r>
@@ -641,8 +628,8 @@
               <w:rPr>
                 <w:b/>
                 <w:bCs/>
-                <w:sz w:val="24"/>
-                <w:szCs w:val="24"/>
+                <w:sz w:val="22"/>
+                <w:szCs w:val="22"/>
               </w:rPr>
               <w:t xml:space="preserve">Causa del daño</w:t>
             </w:r>
@@ -673,10 +660,10 @@
               <w:rPr>
                 <w:b/>
                 <w:bCs/>
-                <w:sz w:val="24"/>
-                <w:szCs w:val="24"/>
-              </w:rPr>
-              <w:t xml:space="preserve">Monto base</w:t>
+                <w:sz w:val="22"/>
+                <w:szCs w:val="22"/>
+              </w:rPr>
+              <w:t xml:space="preserve">Monto demanda</w:t>
             </w:r>
           </w:p>
         </w:tc>
@@ -690,7 +677,7 @@
                 <w:sz w:val="22"/>
                 <w:szCs w:val="22"/>
               </w:rPr>
-              <w:t xml:space="preserve">$20,699.00 MXN (carta formal)</w:t>
+              <w:t xml:space="preserve">$30,699.00 MXN (incluye daño moral)</w:t>
             </w:r>
           </w:p>
         </w:tc>
@@ -705,40 +692,8 @@
               <w:rPr>
                 <w:b/>
                 <w:bCs/>
-                <w:sz w:val="24"/>
-                <w:szCs w:val="24"/>
-              </w:rPr>
-              <w:t xml:space="preserve">Monto demanda</w:t>
-            </w:r>
-          </w:p>
-        </w:tc>
-        <w:tc>
-          <w:tcPr>
-            <w:tcW w:type="pct" w:w="62%"/>
-          </w:tcPr>
-          <w:p>
-            <w:r>
-              <w:rPr>
-                <w:sz w:val="22"/>
-                <w:szCs w:val="22"/>
-              </w:rPr>
-              <w:t xml:space="preserve">$30,699.00 MXN (incluye daño moral)</w:t>
-            </w:r>
-          </w:p>
-        </w:tc>
-      </w:tr>
-      <w:tr>
-        <w:tc>
-          <w:tcPr>
-            <w:tcW w:type="pct" w:w="38%"/>
-          </w:tcPr>
-          <w:p>
-            <w:r>
-              <w:rPr>
-                <w:b/>
-                <w:bCs/>
-                <w:sz w:val="24"/>
-                <w:szCs w:val="24"/>
+                <w:sz w:val="22"/>
+                <w:szCs w:val="22"/>
               </w:rPr>
               <w:t xml:space="preserve">Sitio web del caso</w:t>
             </w:r>
@@ -771,7 +726,7 @@
         <w:pBdr>
           <w:bottom w:val="single" w:color="1a3a5c" w:sz="6"/>
         </w:pBdr>
-        <w:spacing w:after="200" w:before="400"/>
+        <w:spacing w:after="180" w:before="400"/>
       </w:pPr>
       <w:r>
         <w:rPr>
@@ -781,12 +736,12 @@
           <w:sz w:val="30"/>
           <w:szCs w:val="30"/>
         </w:rPr>
-        <w:t xml:space="preserve">2. CHECKLIST — DOCUMENTOS A PRESENTAR</w:t>
-      </w:r>
-    </w:p>
-    <w:p>
-      <w:pPr>
-        <w:spacing w:after="80" w:before="80"/>
+        <w:t xml:space="preserve">2. DOCUMENTOS A PRESENTAR — CON EVIDENCIA FOTOGRÁFICA</w:t>
+      </w:r>
+    </w:p>
+    <w:p>
+      <w:pPr>
+        <w:spacing w:after="60" w:before="60"/>
         <w:ind/>
         <w:jc w:val="both"/>
       </w:pPr>
@@ -797,7 +752,7 @@
           <w:sz w:val="22"/>
           <w:szCs w:val="22"/>
         </w:rPr>
-        <w:t xml:space="preserve">Llevar en ORIGINAL + 2 COPIAS cada documento. Marcar cada uno antes de salir.</w:t>
+        <w:t xml:space="preserve">Llevar en ORIGINAL + 2 COPIAS cada documento. Marcar cada casilla antes de salir.</w:t>
       </w:r>
     </w:p>
     <w:p>
@@ -814,7 +769,7 @@
     </w:p>
     <w:p>
       <w:pPr>
-        <w:spacing w:after="120" w:before="280"/>
+        <w:spacing w:after="100" w:before="280"/>
       </w:pPr>
       <w:r>
         <w:rPr>
@@ -830,14 +785,26 @@
     <w:p>
       <w:pPr>
         <w:spacing w:after="80" w:before="80"/>
+      </w:pPr>
+      <w:r>
+        <w:rPr>
+          <w:sz w:val="22"/>
+          <w:szCs w:val="22"/>
+        </w:rPr>
+        <w:t xml:space="preserve"/>
+      </w:r>
+    </w:p>
+    <w:p>
+      <w:pPr>
+        <w:spacing w:after="60" w:before="100"/>
         <w:ind w:left="360"/>
       </w:pPr>
       <w:r>
         <w:rPr>
           <w:b/>
           <w:bCs/>
-          <w:sz w:val="22"/>
-          <w:szCs w:val="22"/>
+          <w:sz w:val="24"/>
+          <w:szCs w:val="24"/>
         </w:rPr>
         <w:t xml:space="preserve">☐  </w:t>
       </w:r>
@@ -856,20 +823,48 @@
           <w:sz w:val="20"/>
           <w:szCs w:val="20"/>
         </w:rPr>
-        <w:t xml:space="preserve">  (2 copias)</w:t>
+        <w:t xml:space="preserve">   (2 copias)</w:t>
+      </w:r>
+    </w:p>
+    <w:p>
+      <w:pPr>
+        <w:spacing w:after="180" w:before="0"/>
+        <w:jc w:val="center"/>
+      </w:pPr>
+      <w:r>
+        <w:rPr>
+          <w:i/>
+          <w:iCs/>
+          <w:color w:val="555555"/>
+          <w:sz w:val="18"/>
+          <w:szCs w:val="18"/>
+        </w:rPr>
+        <w:t xml:space="preserve">📌 Ver PDF adjunto: evidencias/carta-formal-adjunto.pdf — imprimir por separado</w:t>
       </w:r>
     </w:p>
     <w:p>
       <w:pPr>
         <w:spacing w:after="80" w:before="80"/>
+      </w:pPr>
+      <w:r>
+        <w:rPr>
+          <w:sz w:val="22"/>
+          <w:szCs w:val="22"/>
+        </w:rPr>
+        <w:t xml:space="preserve"/>
+      </w:r>
+    </w:p>
+    <w:p>
+      <w:pPr>
+        <w:spacing w:after="60" w:before="100"/>
         <w:ind w:left="360"/>
       </w:pPr>
       <w:r>
         <w:rPr>
           <w:b/>
           <w:bCs/>
-          <w:sz w:val="22"/>
-          <w:szCs w:val="22"/>
+          <w:sz w:val="24"/>
+          <w:szCs w:val="24"/>
         </w:rPr>
         <w:t xml:space="preserve">☐  </w:t>
       </w:r>
@@ -888,20 +883,100 @@
           <w:sz w:val="20"/>
           <w:szCs w:val="20"/>
         </w:rPr>
-        <w:t xml:space="preserve">  (sin respuesta)</w:t>
+        <w:t xml:space="preserve">   (sin respuesta)</w:t>
+      </w:r>
+    </w:p>
+    <w:p>
+      <w:pPr>
+        <w:spacing w:after="30" w:before="60"/>
+        <w:jc w:val="center"/>
+      </w:pPr>
+      <w:r>
+        <w:rPr>
+          <w:i/>
+          <w:iCs/>
+          <w:color w:val="444444"/>
+          <w:sz w:val="18"/>
+          <w:szCs w:val="18"/>
+        </w:rPr>
+        <w:t xml:space="preserve">Correo enviado 18 feb 2026, 3:56 p.m. — sin respuesta</w:t>
+      </w:r>
+    </w:p>
+    <w:p>
+      <w:pPr>
+        <w:pBdr>
+          <w:top w:val="single" w:color="cccccc" w:sz="2"/>
+          <w:bottom w:val="single" w:color="cccccc" w:sz="2"/>
+          <w:left w:val="single" w:color="cccccc" w:sz="2"/>
+          <w:right w:val="single" w:color="cccccc" w:sz="2"/>
+        </w:pBdr>
+        <w:spacing w:after="100" w:before="0"/>
+        <w:jc w:val="center"/>
+      </w:pPr>
+      <w:r>
+        <w:drawing>
+          <wp:inline distT="0" distB="0" distL="0" distR="0">
+            <wp:extent cx="4572000" cy="1238250"/>
+            <wp:effectExtent t="0" r="0" b="0" l="0"/>
+            <wp:docPr id="1" name="" descr="" title=""/>
+            <wp:cNvGraphicFramePr>
+              <a:graphicFrameLocks xmlns:a="http://schemas.openxmlformats.org/drawingml/2006/main" noChangeAspect="1"/>
+            </wp:cNvGraphicFramePr>
+            <a:graphic xmlns:a="http://schemas.openxmlformats.org/drawingml/2006/main">
+              <a:graphicData uri="http://schemas.openxmlformats.org/drawingml/2006/picture">
+                <pic:pic xmlns:pic="http://schemas.openxmlformats.org/drawingml/2006/picture">
+                  <pic:nvPicPr>
+                    <pic:cNvPr id="0" name="" descr=""/>
+                    <pic:cNvPicPr>
+                      <a:picLocks noChangeAspect="1" noChangeArrowheads="1"/>
+                    </pic:cNvPicPr>
+                  </pic:nvPicPr>
+                  <pic:blipFill>
+                    <a:blip r:embed="rId7" cstate="none"/>
+                    <a:srcRect/>
+                    <a:stretch>
+                      <a:fillRect/>
+                    </a:stretch>
+                  </pic:blipFill>
+                  <pic:spPr bwMode="auto">
+                    <a:xfrm>
+                      <a:off x="0" y="0"/>
+                      <a:ext cx="4572000" cy="1238250"/>
+                    </a:xfrm>
+                    <a:prstGeom prst="rect">
+                      <a:avLst/>
+                    </a:prstGeom>
+                  </pic:spPr>
+                </pic:pic>
+              </a:graphicData>
+            </a:graphic>
+          </wp:inline>
+        </w:drawing>
       </w:r>
     </w:p>
     <w:p>
       <w:pPr>
         <w:spacing w:after="80" w:before="80"/>
+      </w:pPr>
+      <w:r>
+        <w:rPr>
+          <w:sz w:val="22"/>
+          <w:szCs w:val="22"/>
+        </w:rPr>
+        <w:t xml:space="preserve"/>
+      </w:r>
+    </w:p>
+    <w:p>
+      <w:pPr>
+        <w:spacing w:after="60" w:before="100"/>
         <w:ind w:left="360"/>
       </w:pPr>
       <w:r>
         <w:rPr>
           <w:b/>
           <w:bCs/>
-          <w:sz w:val="22"/>
-          <w:szCs w:val="22"/>
+          <w:sz w:val="24"/>
+          <w:szCs w:val="24"/>
         </w:rPr>
         <w:t xml:space="preserve">☐  </w:t>
       </w:r>
@@ -910,20 +985,100 @@
           <w:sz w:val="22"/>
           <w:szCs w:val="22"/>
         </w:rPr>
-        <w:t xml:space="preserve">Captura de pantalla de WhatsApp: 16 feb — Fernanda responde "Gracias" al caso</w:t>
+        <w:t xml:space="preserve">Capturas WhatsApp: 16 feb (Fernanda responde "Gracias") y 21 feb (entregado, sin respuesta)</w:t>
+      </w:r>
+    </w:p>
+    <w:p>
+      <w:pPr>
+        <w:spacing w:after="30" w:before="60"/>
+        <w:jc w:val="center"/>
+      </w:pPr>
+      <w:r>
+        <w:rPr>
+          <w:i/>
+          <w:iCs/>
+          <w:color w:val="444444"/>
+          <w:sz w:val="18"/>
+          <w:szCs w:val="18"/>
+        </w:rPr>
+        <w:t xml:space="preserve">WhatsApp con Fernanda Escobedo — 16 feb leído y respondido "Gracias" / 21 feb ignorado</w:t>
+      </w:r>
+    </w:p>
+    <w:p>
+      <w:pPr>
+        <w:pBdr>
+          <w:top w:val="single" w:color="cccccc" w:sz="2"/>
+          <w:bottom w:val="single" w:color="cccccc" w:sz="2"/>
+          <w:left w:val="single" w:color="cccccc" w:sz="2"/>
+          <w:right w:val="single" w:color="cccccc" w:sz="2"/>
+        </w:pBdr>
+        <w:spacing w:after="100" w:before="0"/>
+        <w:jc w:val="center"/>
+      </w:pPr>
+      <w:r>
+        <w:drawing>
+          <wp:inline distT="0" distB="0" distL="0" distR="0">
+            <wp:extent cx="2667000" cy="4572000"/>
+            <wp:effectExtent t="0" r="0" b="0" l="0"/>
+            <wp:docPr id="1" name="" descr="" title=""/>
+            <wp:cNvGraphicFramePr>
+              <a:graphicFrameLocks xmlns:a="http://schemas.openxmlformats.org/drawingml/2006/main" noChangeAspect="1"/>
+            </wp:cNvGraphicFramePr>
+            <a:graphic xmlns:a="http://schemas.openxmlformats.org/drawingml/2006/main">
+              <a:graphicData uri="http://schemas.openxmlformats.org/drawingml/2006/picture">
+                <pic:pic xmlns:pic="http://schemas.openxmlformats.org/drawingml/2006/picture">
+                  <pic:nvPicPr>
+                    <pic:cNvPr id="0" name="" descr=""/>
+                    <pic:cNvPicPr>
+                      <a:picLocks noChangeAspect="1" noChangeArrowheads="1"/>
+                    </pic:cNvPicPr>
+                  </pic:nvPicPr>
+                  <pic:blipFill>
+                    <a:blip r:embed="rId8" cstate="none"/>
+                    <a:srcRect/>
+                    <a:stretch>
+                      <a:fillRect/>
+                    </a:stretch>
+                  </pic:blipFill>
+                  <pic:spPr bwMode="auto">
+                    <a:xfrm>
+                      <a:off x="0" y="0"/>
+                      <a:ext cx="2667000" cy="4572000"/>
+                    </a:xfrm>
+                    <a:prstGeom prst="rect">
+                      <a:avLst/>
+                    </a:prstGeom>
+                  </pic:spPr>
+                </pic:pic>
+              </a:graphicData>
+            </a:graphic>
+          </wp:inline>
+        </w:drawing>
       </w:r>
     </w:p>
     <w:p>
       <w:pPr>
         <w:spacing w:after="80" w:before="80"/>
+      </w:pPr>
+      <w:r>
+        <w:rPr>
+          <w:sz w:val="22"/>
+          <w:szCs w:val="22"/>
+        </w:rPr>
+        <w:t xml:space="preserve"/>
+      </w:r>
+    </w:p>
+    <w:p>
+      <w:pPr>
+        <w:spacing w:after="60" w:before="100"/>
         <w:ind w:left="360"/>
       </w:pPr>
       <w:r>
         <w:rPr>
           <w:b/>
           <w:bCs/>
-          <w:sz w:val="22"/>
-          <w:szCs w:val="22"/>
+          <w:sz w:val="24"/>
+          <w:szCs w:val="24"/>
         </w:rPr>
         <w:t xml:space="preserve">☐  </w:t>
       </w:r>
@@ -932,51 +1087,7 @@
           <w:sz w:val="22"/>
           <w:szCs w:val="22"/>
         </w:rPr>
-        <w:t xml:space="preserve">Captura de pantalla de WhatsApp: 21 feb — pregunta sobre correo, entregado sin respuesta</w:t>
-      </w:r>
-    </w:p>
-    <w:p>
-      <w:pPr>
-        <w:spacing w:after="80" w:before="80"/>
-        <w:ind w:left="360"/>
-      </w:pPr>
-      <w:r>
-        <w:rPr>
-          <w:b/>
-          <w:bCs/>
-          <w:sz w:val="22"/>
-          <w:szCs w:val="22"/>
-        </w:rPr>
-        <w:t xml:space="preserve">☐  </w:t>
-      </w:r>
-      <w:r>
-        <w:rPr>
-          <w:sz w:val="22"/>
-          <w:szCs w:val="22"/>
-        </w:rPr>
-        <w:t xml:space="preserve">Captura de pantalla de WhatsApp: notificación de inicio de demanda, sin respuesta</w:t>
-      </w:r>
-    </w:p>
-    <w:p>
-      <w:pPr>
-        <w:spacing w:after="80" w:before="80"/>
-        <w:ind w:left="360"/>
-      </w:pPr>
-      <w:r>
-        <w:rPr>
-          <w:b/>
-          <w:bCs/>
-          <w:sz w:val="22"/>
-          <w:szCs w:val="22"/>
-        </w:rPr>
-        <w:t xml:space="preserve">☐  </w:t>
-      </w:r>
-      <w:r>
-        <w:rPr>
-          <w:sz w:val="22"/>
-          <w:szCs w:val="22"/>
-        </w:rPr>
-        <w:t xml:space="preserve">Tarjeta de presentación del Salón Extravaganza</w:t>
+        <w:t xml:space="preserve">Captura WhatsApp: notificación de inicio de demanda con oferta de conciliación</w:t>
       </w:r>
       <w:r>
         <w:rPr>
@@ -986,7 +1097,75 @@
           <w:sz w:val="20"/>
           <w:szCs w:val="20"/>
         </w:rPr>
-        <w:t xml:space="preserve">  (Fernanda Escobedo, Asistente Administrativo)</w:t>
+        <w:t xml:space="preserve">   (sin respuesta)</w:t>
+      </w:r>
+    </w:p>
+    <w:p>
+      <w:pPr>
+        <w:spacing w:after="30" w:before="60"/>
+        <w:jc w:val="center"/>
+      </w:pPr>
+      <w:r>
+        <w:rPr>
+          <w:i/>
+          <w:iCs/>
+          <w:color w:val="444444"/>
+          <w:sz w:val="18"/>
+          <w:szCs w:val="18"/>
+        </w:rPr>
+        <w:t xml:space="preserve">WhatsApp: notificación inicio de demanda — entregado sin respuesta</w:t>
+      </w:r>
+    </w:p>
+    <w:p>
+      <w:pPr>
+        <w:pBdr>
+          <w:top w:val="single" w:color="cccccc" w:sz="2"/>
+          <w:bottom w:val="single" w:color="cccccc" w:sz="2"/>
+          <w:left w:val="single" w:color="cccccc" w:sz="2"/>
+          <w:right w:val="single" w:color="cccccc" w:sz="2"/>
+        </w:pBdr>
+        <w:spacing w:after="100" w:before="0"/>
+        <w:jc w:val="center"/>
+      </w:pPr>
+      <w:r>
+        <w:drawing>
+          <wp:inline distT="0" distB="0" distL="0" distR="0">
+            <wp:extent cx="4572000" cy="2857500"/>
+            <wp:effectExtent t="0" r="0" b="0" l="0"/>
+            <wp:docPr id="1" name="" descr="" title=""/>
+            <wp:cNvGraphicFramePr>
+              <a:graphicFrameLocks xmlns:a="http://schemas.openxmlformats.org/drawingml/2006/main" noChangeAspect="1"/>
+            </wp:cNvGraphicFramePr>
+            <a:graphic xmlns:a="http://schemas.openxmlformats.org/drawingml/2006/main">
+              <a:graphicData uri="http://schemas.openxmlformats.org/drawingml/2006/picture">
+                <pic:pic xmlns:pic="http://schemas.openxmlformats.org/drawingml/2006/picture">
+                  <pic:nvPicPr>
+                    <pic:cNvPr id="0" name="" descr=""/>
+                    <pic:cNvPicPr>
+                      <a:picLocks noChangeAspect="1" noChangeArrowheads="1"/>
+                    </pic:cNvPicPr>
+                  </pic:nvPicPr>
+                  <pic:blipFill>
+                    <a:blip r:embed="rId9" cstate="none"/>
+                    <a:srcRect/>
+                    <a:stretch>
+                      <a:fillRect/>
+                    </a:stretch>
+                  </pic:blipFill>
+                  <pic:spPr bwMode="auto">
+                    <a:xfrm>
+                      <a:off x="0" y="0"/>
+                      <a:ext cx="4572000" cy="2857500"/>
+                    </a:xfrm>
+                    <a:prstGeom prst="rect">
+                      <a:avLst/>
+                    </a:prstGeom>
+                  </pic:spPr>
+                </pic:pic>
+              </a:graphicData>
+            </a:graphic>
+          </wp:inline>
+        </w:drawing>
       </w:r>
     </w:p>
     <w:p>
@@ -1003,31 +1182,16 @@
     </w:p>
     <w:p>
       <w:pPr>
-        <w:spacing w:after="120" w:before="280"/>
-      </w:pPr>
-      <w:r>
-        <w:rPr>
-          <w:b/>
-          <w:bCs/>
-          <w:color w:val="2c5f8a"/>
+        <w:spacing w:after="60" w:before="100"/>
+        <w:ind w:left="360"/>
+      </w:pPr>
+      <w:r>
+        <w:rPr>
+          <w:b/>
+          <w:bCs/>
           <w:sz w:val="24"/>
           <w:szCs w:val="24"/>
         </w:rPr>
-        <w:t xml:space="preserve">Evidencia del equipo dañado</w:t>
-      </w:r>
-    </w:p>
-    <w:p>
-      <w:pPr>
-        <w:spacing w:after="80" w:before="80"/>
-        <w:ind w:left="360"/>
-      </w:pPr>
-      <w:r>
-        <w:rPr>
-          <w:b/>
-          <w:bCs/>
-          <w:sz w:val="22"/>
-          <w:szCs w:val="22"/>
-        </w:rPr>
         <w:t xml:space="preserve">☐  </w:t>
       </w:r>
       <w:r>
@@ -1035,7 +1199,7 @@
           <w:sz w:val="22"/>
           <w:szCs w:val="22"/>
         </w:rPr>
-        <w:t xml:space="preserve">Comprobante de compra Liverpool — $14,399 MXN</w:t>
+        <w:t xml:space="preserve">Tarjeta de presentación del Salón Extravaganza</w:t>
       </w:r>
       <w:r>
         <w:rPr>
@@ -1045,20 +1209,120 @@
           <w:sz w:val="20"/>
           <w:szCs w:val="20"/>
         </w:rPr>
-        <w:t xml:space="preserve">  (21 nov 2024, No. pedido 3330051311)</w:t>
+        <w:t xml:space="preserve">   (Fernanda Escobedo, Asistente Administrativo)</w:t>
+      </w:r>
+    </w:p>
+    <w:p>
+      <w:pPr>
+        <w:spacing w:after="30" w:before="60"/>
+        <w:jc w:val="center"/>
+      </w:pPr>
+      <w:r>
+        <w:rPr>
+          <w:i/>
+          <w:iCs/>
+          <w:color w:val="444444"/>
+          <w:sz w:val="18"/>
+          <w:szCs w:val="18"/>
+        </w:rPr>
+        <w:t xml:space="preserve">Tarjeta: Fernanda Escobedo — 477 255 1093 — administracion@salonextravaganza.com</w:t>
+      </w:r>
+    </w:p>
+    <w:p>
+      <w:pPr>
+        <w:pBdr>
+          <w:top w:val="single" w:color="cccccc" w:sz="2"/>
+          <w:bottom w:val="single" w:color="cccccc" w:sz="2"/>
+          <w:left w:val="single" w:color="cccccc" w:sz="2"/>
+          <w:right w:val="single" w:color="cccccc" w:sz="2"/>
+        </w:pBdr>
+        <w:spacing w:after="100" w:before="0"/>
+        <w:jc w:val="center"/>
+      </w:pPr>
+      <w:r>
+        <w:drawing>
+          <wp:inline distT="0" distB="0" distL="0" distR="0">
+            <wp:extent cx="4000500" cy="2190750"/>
+            <wp:effectExtent t="0" r="0" b="0" l="0"/>
+            <wp:docPr id="1" name="" descr="" title=""/>
+            <wp:cNvGraphicFramePr>
+              <a:graphicFrameLocks xmlns:a="http://schemas.openxmlformats.org/drawingml/2006/main" noChangeAspect="1"/>
+            </wp:cNvGraphicFramePr>
+            <a:graphic xmlns:a="http://schemas.openxmlformats.org/drawingml/2006/main">
+              <a:graphicData uri="http://schemas.openxmlformats.org/drawingml/2006/picture">
+                <pic:pic xmlns:pic="http://schemas.openxmlformats.org/drawingml/2006/picture">
+                  <pic:nvPicPr>
+                    <pic:cNvPr id="0" name="" descr=""/>
+                    <pic:cNvPicPr>
+                      <a:picLocks noChangeAspect="1" noChangeArrowheads="1"/>
+                    </pic:cNvPicPr>
+                  </pic:nvPicPr>
+                  <pic:blipFill>
+                    <a:blip r:embed="rId10" cstate="none"/>
+                    <a:srcRect/>
+                    <a:stretch>
+                      <a:fillRect/>
+                    </a:stretch>
+                  </pic:blipFill>
+                  <pic:spPr bwMode="auto">
+                    <a:xfrm>
+                      <a:off x="0" y="0"/>
+                      <a:ext cx="4000500" cy="2190750"/>
+                    </a:xfrm>
+                    <a:prstGeom prst="rect">
+                      <a:avLst/>
+                    </a:prstGeom>
+                  </pic:spPr>
+                </pic:pic>
+              </a:graphicData>
+            </a:graphic>
+          </wp:inline>
+        </w:drawing>
+      </w:r>
+    </w:p>
+    <w:p>
+      <w:r>
+        <w:br w:type="page"/>
+      </w:r>
+    </w:p>
+    <w:p>
+      <w:pPr>
+        <w:spacing w:after="100" w:before="280"/>
+      </w:pPr>
+      <w:r>
+        <w:rPr>
+          <w:b/>
+          <w:bCs/>
+          <w:color w:val="2c5f8a"/>
+          <w:sz w:val="24"/>
+          <w:szCs w:val="24"/>
+        </w:rPr>
+        <w:t xml:space="preserve">Evidencia del equipo dañado</w:t>
       </w:r>
     </w:p>
     <w:p>
       <w:pPr>
         <w:spacing w:after="80" w:before="80"/>
+      </w:pPr>
+      <w:r>
+        <w:rPr>
+          <w:sz w:val="22"/>
+          <w:szCs w:val="22"/>
+        </w:rPr>
+        <w:t xml:space="preserve"/>
+      </w:r>
+    </w:p>
+    <w:p>
+      <w:pPr>
+        <w:spacing w:after="60" w:before="100"/>
         <w:ind w:left="360"/>
       </w:pPr>
       <w:r>
         <w:rPr>
           <w:b/>
           <w:bCs/>
-          <w:sz w:val="22"/>
-          <w:szCs w:val="22"/>
+          <w:sz w:val="24"/>
+          <w:szCs w:val="24"/>
         </w:rPr>
         <w:t xml:space="preserve">☐  </w:t>
       </w:r>
@@ -1067,29 +1331,7 @@
           <w:sz w:val="22"/>
           <w:szCs w:val="22"/>
         </w:rPr>
-        <w:t xml:space="preserve">Comprobante de pedido Liverpool #3330051311</w:t>
-      </w:r>
-    </w:p>
-    <w:p>
-      <w:pPr>
-        <w:spacing w:after="80" w:before="80"/>
-        <w:ind w:left="360"/>
-      </w:pPr>
-      <w:r>
-        <w:rPr>
-          <w:b/>
-          <w:bCs/>
-          <w:sz w:val="22"/>
-          <w:szCs w:val="22"/>
-        </w:rPr>
-        <w:t xml:space="preserve">☐  </w:t>
-      </w:r>
-      <w:r>
-        <w:rPr>
-          <w:sz w:val="22"/>
-          <w:szCs w:val="22"/>
-        </w:rPr>
-        <w:t xml:space="preserve">Foto del sensor dañado</w:t>
+        <w:t xml:space="preserve">Comprobante de compra Liverpool — $14,399 MXN</w:t>
       </w:r>
       <w:r>
         <w:rPr>
@@ -1099,20 +1341,100 @@
           <w:sz w:val="20"/>
           <w:szCs w:val="20"/>
         </w:rPr>
-        <w:t xml:space="preserve">  (línea punteada negra + punto blanco + línea roja)</w:t>
+        <w:t xml:space="preserve">   (21 nov 2024, No. pedido 3330051311)</w:t>
+      </w:r>
+    </w:p>
+    <w:p>
+      <w:pPr>
+        <w:spacing w:after="30" w:before="60"/>
+        <w:jc w:val="center"/>
+      </w:pPr>
+      <w:r>
+        <w:rPr>
+          <w:i/>
+          <w:iCs/>
+          <w:color w:val="444444"/>
+          <w:sz w:val="18"/>
+          <w:szCs w:val="18"/>
+        </w:rPr>
+        <w:t xml:space="preserve">Comprobante Liverpool — $14,399 MXN, 21 nov 2024, No. pedido 3330051311</w:t>
+      </w:r>
+    </w:p>
+    <w:p>
+      <w:pPr>
+        <w:pBdr>
+          <w:top w:val="single" w:color="cccccc" w:sz="2"/>
+          <w:bottom w:val="single" w:color="cccccc" w:sz="2"/>
+          <w:left w:val="single" w:color="cccccc" w:sz="2"/>
+          <w:right w:val="single" w:color="cccccc" w:sz="2"/>
+        </w:pBdr>
+        <w:spacing w:after="100" w:before="0"/>
+        <w:jc w:val="center"/>
+      </w:pPr>
+      <w:r>
+        <w:drawing>
+          <wp:inline distT="0" distB="0" distL="0" distR="0">
+            <wp:extent cx="3810000" cy="5334000"/>
+            <wp:effectExtent t="0" r="0" b="0" l="0"/>
+            <wp:docPr id="1" name="" descr="" title=""/>
+            <wp:cNvGraphicFramePr>
+              <a:graphicFrameLocks xmlns:a="http://schemas.openxmlformats.org/drawingml/2006/main" noChangeAspect="1"/>
+            </wp:cNvGraphicFramePr>
+            <a:graphic xmlns:a="http://schemas.openxmlformats.org/drawingml/2006/main">
+              <a:graphicData uri="http://schemas.openxmlformats.org/drawingml/2006/picture">
+                <pic:pic xmlns:pic="http://schemas.openxmlformats.org/drawingml/2006/picture">
+                  <pic:nvPicPr>
+                    <pic:cNvPr id="0" name="" descr=""/>
+                    <pic:cNvPicPr>
+                      <a:picLocks noChangeAspect="1" noChangeArrowheads="1"/>
+                    </pic:cNvPicPr>
+                  </pic:nvPicPr>
+                  <pic:blipFill>
+                    <a:blip r:embed="rId11" cstate="none"/>
+                    <a:srcRect/>
+                    <a:stretch>
+                      <a:fillRect/>
+                    </a:stretch>
+                  </pic:blipFill>
+                  <pic:spPr bwMode="auto">
+                    <a:xfrm>
+                      <a:off x="0" y="0"/>
+                      <a:ext cx="3810000" cy="5334000"/>
+                    </a:xfrm>
+                    <a:prstGeom prst="rect">
+                      <a:avLst/>
+                    </a:prstGeom>
+                  </pic:spPr>
+                </pic:pic>
+              </a:graphicData>
+            </a:graphic>
+          </wp:inline>
+        </w:drawing>
       </w:r>
     </w:p>
     <w:p>
       <w:pPr>
         <w:spacing w:after="80" w:before="80"/>
+      </w:pPr>
+      <w:r>
+        <w:rPr>
+          <w:sz w:val="22"/>
+          <w:szCs w:val="22"/>
+        </w:rPr>
+        <w:t xml:space="preserve"/>
+      </w:r>
+    </w:p>
+    <w:p>
+      <w:pPr>
+        <w:spacing w:after="60" w:before="100"/>
         <w:ind w:left="360"/>
       </w:pPr>
       <w:r>
         <w:rPr>
           <w:b/>
           <w:bCs/>
-          <w:sz w:val="22"/>
-          <w:szCs w:val="22"/>
+          <w:sz w:val="24"/>
+          <w:szCs w:val="24"/>
         </w:rPr>
         <w:t xml:space="preserve">☐  </w:t>
       </w:r>
@@ -1121,20 +1443,93 @@
           <w:sz w:val="22"/>
           <w:szCs w:val="22"/>
         </w:rPr>
-        <w:t xml:space="preserve">Foto de la cámara DJI Osmo Pocket 3 física</w:t>
-      </w:r>
-    </w:p>
-    <w:p>
-      <w:pPr>
-        <w:spacing w:after="80" w:before="80"/>
+        <w:t xml:space="preserve">Comprobante de pedido Liverpool #3330051311</w:t>
+      </w:r>
+    </w:p>
+    <w:p>
+      <w:pPr>
+        <w:spacing w:after="30" w:before="60"/>
+        <w:jc w:val="center"/>
+      </w:pPr>
+      <w:r>
+        <w:rPr>
+          <w:i/>
+          <w:iCs/>
+          <w:color w:val="444444"/>
+          <w:sz w:val="18"/>
+          <w:szCs w:val="18"/>
+        </w:rPr>
+        <w:t xml:space="preserve">Pedido #3330051311 — DJI Osmo Pocket 3 Creator Combo, código 1146637015</w:t>
+      </w:r>
+    </w:p>
+    <w:p>
+      <w:pPr>
+        <w:pBdr>
+          <w:top w:val="single" w:color="cccccc" w:sz="2"/>
+          <w:bottom w:val="single" w:color="cccccc" w:sz="2"/>
+          <w:left w:val="single" w:color="cccccc" w:sz="2"/>
+          <w:right w:val="single" w:color="cccccc" w:sz="2"/>
+        </w:pBdr>
+        <w:spacing w:after="100" w:before="0"/>
+        <w:jc w:val="center"/>
+      </w:pPr>
+      <w:r>
+        <w:drawing>
+          <wp:inline distT="0" distB="0" distL="0" distR="0">
+            <wp:extent cx="3810000" cy="5334000"/>
+            <wp:effectExtent t="0" r="0" b="0" l="0"/>
+            <wp:docPr id="1" name="" descr="" title=""/>
+            <wp:cNvGraphicFramePr>
+              <a:graphicFrameLocks xmlns:a="http://schemas.openxmlformats.org/drawingml/2006/main" noChangeAspect="1"/>
+            </wp:cNvGraphicFramePr>
+            <a:graphic xmlns:a="http://schemas.openxmlformats.org/drawingml/2006/main">
+              <a:graphicData uri="http://schemas.openxmlformats.org/drawingml/2006/picture">
+                <pic:pic xmlns:pic="http://schemas.openxmlformats.org/drawingml/2006/picture">
+                  <pic:nvPicPr>
+                    <pic:cNvPr id="0" name="" descr=""/>
+                    <pic:cNvPicPr>
+                      <a:picLocks noChangeAspect="1" noChangeArrowheads="1"/>
+                    </pic:cNvPicPr>
+                  </pic:nvPicPr>
+                  <pic:blipFill>
+                    <a:blip r:embed="rId12" cstate="none"/>
+                    <a:srcRect/>
+                    <a:stretch>
+                      <a:fillRect/>
+                    </a:stretch>
+                  </pic:blipFill>
+                  <pic:spPr bwMode="auto">
+                    <a:xfrm>
+                      <a:off x="0" y="0"/>
+                      <a:ext cx="3810000" cy="5334000"/>
+                    </a:xfrm>
+                    <a:prstGeom prst="rect">
+                      <a:avLst/>
+                    </a:prstGeom>
+                  </pic:spPr>
+                </pic:pic>
+              </a:graphicData>
+            </a:graphic>
+          </wp:inline>
+        </w:drawing>
+      </w:r>
+    </w:p>
+    <w:p>
+      <w:r>
+        <w:br w:type="page"/>
+      </w:r>
+    </w:p>
+    <w:p>
+      <w:pPr>
+        <w:spacing w:after="60" w:before="100"/>
         <w:ind w:left="360"/>
       </w:pPr>
       <w:r>
         <w:rPr>
           <w:b/>
           <w:bCs/>
-          <w:sz w:val="22"/>
-          <w:szCs w:val="22"/>
+          <w:sz w:val="24"/>
+          <w:szCs w:val="24"/>
         </w:rPr>
         <w:t xml:space="preserve">☐  </w:t>
       </w:r>
@@ -1143,7 +1538,7 @@
           <w:sz w:val="22"/>
           <w:szCs w:val="22"/>
         </w:rPr>
-        <w:t xml:space="preserve">Captura de la pantalla DJI mostrando "sin cobertura de reparación"</w:t>
+        <w:t xml:space="preserve">Foto del sensor dañado</w:t>
       </w:r>
       <w:r>
         <w:rPr>
@@ -1153,69 +1548,202 @@
           <w:sz w:val="20"/>
           <w:szCs w:val="20"/>
         </w:rPr>
-        <w:t xml:space="preserve">  (serie 5WTZM9C002CVXL)</w:t>
+        <w:t xml:space="preserve">   (línea punteada negra + punto blanco + línea roja)</w:t>
+      </w:r>
+    </w:p>
+    <w:p>
+      <w:pPr>
+        <w:spacing w:after="30" w:before="60"/>
+        <w:jc w:val="center"/>
+      </w:pPr>
+      <w:r>
+        <w:rPr>
+          <w:i/>
+          <w:iCs/>
+          <w:color w:val="444444"/>
+          <w:sz w:val="18"/>
+          <w:szCs w:val="18"/>
+        </w:rPr>
+        <w:t xml:space="preserve">Sensor CMOS — patrón de daño permanente por impacto del láser YUER RGB</w:t>
+      </w:r>
+    </w:p>
+    <w:p>
+      <w:pPr>
+        <w:pBdr>
+          <w:top w:val="single" w:color="cccccc" w:sz="2"/>
+          <w:bottom w:val="single" w:color="cccccc" w:sz="2"/>
+          <w:left w:val="single" w:color="cccccc" w:sz="2"/>
+          <w:right w:val="single" w:color="cccccc" w:sz="2"/>
+        </w:pBdr>
+        <w:spacing w:after="100" w:before="0"/>
+        <w:jc w:val="center"/>
+      </w:pPr>
+      <w:r>
+        <w:drawing>
+          <wp:inline distT="0" distB="0" distL="0" distR="0">
+            <wp:extent cx="3048000" cy="2000250"/>
+            <wp:effectExtent t="0" r="0" b="0" l="0"/>
+            <wp:docPr id="1" name="" descr="" title=""/>
+            <wp:cNvGraphicFramePr>
+              <a:graphicFrameLocks xmlns:a="http://schemas.openxmlformats.org/drawingml/2006/main" noChangeAspect="1"/>
+            </wp:cNvGraphicFramePr>
+            <a:graphic xmlns:a="http://schemas.openxmlformats.org/drawingml/2006/main">
+              <a:graphicData uri="http://schemas.openxmlformats.org/drawingml/2006/picture">
+                <pic:pic xmlns:pic="http://schemas.openxmlformats.org/drawingml/2006/picture">
+                  <pic:nvPicPr>
+                    <pic:cNvPr id="0" name="" descr=""/>
+                    <pic:cNvPicPr>
+                      <a:picLocks noChangeAspect="1" noChangeArrowheads="1"/>
+                    </pic:cNvPicPr>
+                  </pic:nvPicPr>
+                  <pic:blipFill>
+                    <a:blip r:embed="rId13" cstate="none"/>
+                    <a:srcRect/>
+                    <a:stretch>
+                      <a:fillRect/>
+                    </a:stretch>
+                  </pic:blipFill>
+                  <pic:spPr bwMode="auto">
+                    <a:xfrm>
+                      <a:off x="0" y="0"/>
+                      <a:ext cx="3048000" cy="2000250"/>
+                    </a:xfrm>
+                    <a:prstGeom prst="rect">
+                      <a:avLst/>
+                    </a:prstGeom>
+                  </pic:spPr>
+                </pic:pic>
+              </a:graphicData>
+            </a:graphic>
+          </wp:inline>
+        </w:drawing>
       </w:r>
     </w:p>
     <w:p>
       <w:pPr>
         <w:spacing w:after="80" w:before="80"/>
+      </w:pPr>
+      <w:r>
+        <w:rPr>
+          <w:sz w:val="22"/>
+          <w:szCs w:val="22"/>
+        </w:rPr>
+        <w:t xml:space="preserve"/>
+      </w:r>
+    </w:p>
+    <w:p>
+      <w:pPr>
+        <w:spacing w:after="60" w:before="100"/>
         <w:ind w:left="360"/>
       </w:pPr>
       <w:r>
         <w:rPr>
           <w:b/>
           <w:bCs/>
-          <w:sz w:val="22"/>
-          <w:szCs w:val="22"/>
-        </w:rPr>
-        <w:t xml:space="preserve">☐  </w:t>
-      </w:r>
-      <w:r>
-        <w:rPr>
-          <w:sz w:val="22"/>
-          <w:szCs w:val="22"/>
-        </w:rPr>
-        <w:t xml:space="preserve">Captura del precio de reemplazo actual: $9,199 MXN en Liverpool</w:t>
-      </w:r>
-    </w:p>
-    <w:p>
-      <w:pPr>
-        <w:spacing w:after="80" w:before="80"/>
-      </w:pPr>
-      <w:r>
-        <w:rPr>
-          <w:sz w:val="22"/>
-          <w:szCs w:val="22"/>
-        </w:rPr>
-        <w:t xml:space="preserve"/>
-      </w:r>
-    </w:p>
-    <w:p>
-      <w:pPr>
-        <w:spacing w:after="120" w:before="280"/>
-      </w:pPr>
-      <w:r>
-        <w:rPr>
-          <w:b/>
-          <w:bCs/>
-          <w:color w:val="2c5f8a"/>
           <w:sz w:val="24"/>
           <w:szCs w:val="24"/>
         </w:rPr>
-        <w:t xml:space="preserve">Evidencia del incidente</w:t>
+        <w:t xml:space="preserve">☐  </w:t>
+      </w:r>
+      <w:r>
+        <w:rPr>
+          <w:sz w:val="22"/>
+          <w:szCs w:val="22"/>
+        </w:rPr>
+        <w:t xml:space="preserve">Foto de la cámara DJI Osmo Pocket 3 física</w:t>
+      </w:r>
+    </w:p>
+    <w:p>
+      <w:pPr>
+        <w:spacing w:after="30" w:before="60"/>
+        <w:jc w:val="center"/>
+      </w:pPr>
+      <w:r>
+        <w:rPr>
+          <w:i/>
+          <w:iCs/>
+          <w:color w:val="444444"/>
+          <w:sz w:val="18"/>
+          <w:szCs w:val="18"/>
+        </w:rPr>
+        <w:t xml:space="preserve">DJI Osmo Pocket 3 — equipo afectado, serie 5WTZM9C002CVXL</w:t>
+      </w:r>
+    </w:p>
+    <w:p>
+      <w:pPr>
+        <w:pBdr>
+          <w:top w:val="single" w:color="cccccc" w:sz="2"/>
+          <w:bottom w:val="single" w:color="cccccc" w:sz="2"/>
+          <w:left w:val="single" w:color="cccccc" w:sz="2"/>
+          <w:right w:val="single" w:color="cccccc" w:sz="2"/>
+        </w:pBdr>
+        <w:spacing w:after="100" w:before="0"/>
+        <w:jc w:val="center"/>
+      </w:pPr>
+      <w:r>
+        <w:drawing>
+          <wp:inline distT="0" distB="0" distL="0" distR="0">
+            <wp:extent cx="2857500" cy="2667000"/>
+            <wp:effectExtent t="0" r="0" b="0" l="0"/>
+            <wp:docPr id="1" name="" descr="" title=""/>
+            <wp:cNvGraphicFramePr>
+              <a:graphicFrameLocks xmlns:a="http://schemas.openxmlformats.org/drawingml/2006/main" noChangeAspect="1"/>
+            </wp:cNvGraphicFramePr>
+            <a:graphic xmlns:a="http://schemas.openxmlformats.org/drawingml/2006/main">
+              <a:graphicData uri="http://schemas.openxmlformats.org/drawingml/2006/picture">
+                <pic:pic xmlns:pic="http://schemas.openxmlformats.org/drawingml/2006/picture">
+                  <pic:nvPicPr>
+                    <pic:cNvPr id="0" name="" descr=""/>
+                    <pic:cNvPicPr>
+                      <a:picLocks noChangeAspect="1" noChangeArrowheads="1"/>
+                    </pic:cNvPicPr>
+                  </pic:nvPicPr>
+                  <pic:blipFill>
+                    <a:blip r:embed="rId14" cstate="none"/>
+                    <a:srcRect/>
+                    <a:stretch>
+                      <a:fillRect/>
+                    </a:stretch>
+                  </pic:blipFill>
+                  <pic:spPr bwMode="auto">
+                    <a:xfrm>
+                      <a:off x="0" y="0"/>
+                      <a:ext cx="2857500" cy="2667000"/>
+                    </a:xfrm>
+                    <a:prstGeom prst="rect">
+                      <a:avLst/>
+                    </a:prstGeom>
+                  </pic:spPr>
+                </pic:pic>
+              </a:graphicData>
+            </a:graphic>
+          </wp:inline>
+        </w:drawing>
       </w:r>
     </w:p>
     <w:p>
       <w:pPr>
         <w:spacing w:after="80" w:before="80"/>
+      </w:pPr>
+      <w:r>
+        <w:rPr>
+          <w:sz w:val="22"/>
+          <w:szCs w:val="22"/>
+        </w:rPr>
+        <w:t xml:space="preserve"/>
+      </w:r>
+    </w:p>
+    <w:p>
+      <w:pPr>
+        <w:spacing w:after="60" w:before="100"/>
         <w:ind w:left="360"/>
       </w:pPr>
       <w:r>
         <w:rPr>
           <w:b/>
           <w:bCs/>
-          <w:sz w:val="22"/>
-          <w:szCs w:val="22"/>
+          <w:sz w:val="24"/>
+          <w:szCs w:val="24"/>
         </w:rPr>
         <w:t xml:space="preserve">☐  </w:t>
       </w:r>
@@ -1224,73 +1752,7 @@
           <w:sz w:val="22"/>
           <w:szCs w:val="22"/>
         </w:rPr>
-        <w:t xml:space="preserve">Impresión de capturas del video (láser sobre la pista, min 32:36 y min 15:49)</w:t>
-      </w:r>
-    </w:p>
-    <w:p>
-      <w:pPr>
-        <w:spacing w:after="80" w:before="80"/>
-        <w:ind w:left="360"/>
-      </w:pPr>
-      <w:r>
-        <w:rPr>
-          <w:b/>
-          <w:bCs/>
-          <w:sz w:val="22"/>
-          <w:szCs w:val="22"/>
-        </w:rPr>
-        <w:t xml:space="preserve">☐  </w:t>
-      </w:r>
-      <w:r>
-        <w:rPr>
-          <w:sz w:val="22"/>
-          <w:szCs w:val="22"/>
-        </w:rPr>
-        <w:t xml:space="preserve">Impresión de capturas del láser a la altura de los chambelanes y quinceañera</w:t>
-      </w:r>
-    </w:p>
-    <w:p>
-      <w:pPr>
-        <w:spacing w:after="80" w:before="80"/>
-        <w:ind w:left="360"/>
-      </w:pPr>
-      <w:r>
-        <w:rPr>
-          <w:b/>
-          <w:bCs/>
-          <w:sz w:val="22"/>
-          <w:szCs w:val="22"/>
-        </w:rPr>
-        <w:t xml:space="preserve">☐  </w:t>
-      </w:r>
-      <w:r>
-        <w:rPr>
-          <w:sz w:val="22"/>
-          <w:szCs w:val="22"/>
-        </w:rPr>
-        <w:t xml:space="preserve">Zoom de la unidad láser donde se lee la marca "YUE" = YUER</w:t>
-      </w:r>
-    </w:p>
-    <w:p>
-      <w:pPr>
-        <w:spacing w:after="80" w:before="80"/>
-        <w:ind w:left="360"/>
-      </w:pPr>
-      <w:r>
-        <w:rPr>
-          <w:b/>
-          <w:bCs/>
-          <w:sz w:val="22"/>
-          <w:szCs w:val="22"/>
-        </w:rPr>
-        <w:t xml:space="preserve">☐  </w:t>
-      </w:r>
-      <w:r>
-        <w:rPr>
-          <w:sz w:val="22"/>
-          <w:szCs w:val="22"/>
-        </w:rPr>
-        <w:t xml:space="preserve">USB o teléfono con el video del momento exacto del daño</w:t>
+        <w:t xml:space="preserve">Captura DJI "sin cobertura de reparación"</w:t>
       </w:r>
       <w:r>
         <w:rPr>
@@ -1300,20 +1762,100 @@
           <w:sz w:val="20"/>
           <w:szCs w:val="20"/>
         </w:rPr>
-        <w:t xml:space="preserve">  (opcional pero muy recomendado)</w:t>
+        <w:t xml:space="preserve">   (serie 5WTZM9C002CVXL)</w:t>
+      </w:r>
+    </w:p>
+    <w:p>
+      <w:pPr>
+        <w:spacing w:after="30" w:before="60"/>
+        <w:jc w:val="center"/>
+      </w:pPr>
+      <w:r>
+        <w:rPr>
+          <w:i/>
+          <w:iCs/>
+          <w:color w:val="444444"/>
+          <w:sz w:val="18"/>
+          <w:szCs w:val="18"/>
+        </w:rPr>
+        <w:t xml:space="preserve">Portal DJI: "Este servicio no tiene cobertura para este producto"</w:t>
+      </w:r>
+    </w:p>
+    <w:p>
+      <w:pPr>
+        <w:pBdr>
+          <w:top w:val="single" w:color="cccccc" w:sz="2"/>
+          <w:bottom w:val="single" w:color="cccccc" w:sz="2"/>
+          <w:left w:val="single" w:color="cccccc" w:sz="2"/>
+          <w:right w:val="single" w:color="cccccc" w:sz="2"/>
+        </w:pBdr>
+        <w:spacing w:after="100" w:before="0"/>
+        <w:jc w:val="center"/>
+      </w:pPr>
+      <w:r>
+        <w:drawing>
+          <wp:inline distT="0" distB="0" distL="0" distR="0">
+            <wp:extent cx="4000500" cy="3238500"/>
+            <wp:effectExtent t="0" r="0" b="0" l="0"/>
+            <wp:docPr id="1" name="" descr="" title=""/>
+            <wp:cNvGraphicFramePr>
+              <a:graphicFrameLocks xmlns:a="http://schemas.openxmlformats.org/drawingml/2006/main" noChangeAspect="1"/>
+            </wp:cNvGraphicFramePr>
+            <a:graphic xmlns:a="http://schemas.openxmlformats.org/drawingml/2006/main">
+              <a:graphicData uri="http://schemas.openxmlformats.org/drawingml/2006/picture">
+                <pic:pic xmlns:pic="http://schemas.openxmlformats.org/drawingml/2006/picture">
+                  <pic:nvPicPr>
+                    <pic:cNvPr id="0" name="" descr=""/>
+                    <pic:cNvPicPr>
+                      <a:picLocks noChangeAspect="1" noChangeArrowheads="1"/>
+                    </pic:cNvPicPr>
+                  </pic:nvPicPr>
+                  <pic:blipFill>
+                    <a:blip r:embed="rId15" cstate="none"/>
+                    <a:srcRect/>
+                    <a:stretch>
+                      <a:fillRect/>
+                    </a:stretch>
+                  </pic:blipFill>
+                  <pic:spPr bwMode="auto">
+                    <a:xfrm>
+                      <a:off x="0" y="0"/>
+                      <a:ext cx="4000500" cy="3238500"/>
+                    </a:xfrm>
+                    <a:prstGeom prst="rect">
+                      <a:avLst/>
+                    </a:prstGeom>
+                  </pic:spPr>
+                </pic:pic>
+              </a:graphicData>
+            </a:graphic>
+          </wp:inline>
+        </w:drawing>
       </w:r>
     </w:p>
     <w:p>
       <w:pPr>
         <w:spacing w:after="80" w:before="80"/>
+      </w:pPr>
+      <w:r>
+        <w:rPr>
+          <w:sz w:val="22"/>
+          <w:szCs w:val="22"/>
+        </w:rPr>
+        <w:t xml:space="preserve"/>
+      </w:r>
+    </w:p>
+    <w:p>
+      <w:pPr>
+        <w:spacing w:after="60" w:before="100"/>
         <w:ind w:left="360"/>
       </w:pPr>
       <w:r>
         <w:rPr>
           <w:b/>
           <w:bCs/>
-          <w:sz w:val="22"/>
-          <w:szCs w:val="22"/>
+          <w:sz w:val="24"/>
+          <w:szCs w:val="24"/>
         </w:rPr>
         <w:t xml:space="preserve">☐  </w:t>
       </w:r>
@@ -1322,7 +1864,595 @@
           <w:sz w:val="22"/>
           <w:szCs w:val="22"/>
         </w:rPr>
-        <w:t xml:space="preserve">URL del sitio de evidencias: https://caso-laser.invitados.org</w:t>
+        <w:t xml:space="preserve">Captura del precio de reemplazo actual: $9,199 MXN en Liverpool</w:t>
+      </w:r>
+    </w:p>
+    <w:p>
+      <w:pPr>
+        <w:spacing w:after="30" w:before="60"/>
+        <w:jc w:val="center"/>
+      </w:pPr>
+      <w:r>
+        <w:rPr>
+          <w:i/>
+          <w:iCs/>
+          <w:color w:val="444444"/>
+          <w:sz w:val="18"/>
+          <w:szCs w:val="18"/>
+        </w:rPr>
+        <w:t xml:space="preserve">Precio de reemplazo DJI Osmo Pocket 3 — $9,199 MXN en Liverpool</w:t>
+      </w:r>
+    </w:p>
+    <w:p>
+      <w:pPr>
+        <w:pBdr>
+          <w:top w:val="single" w:color="cccccc" w:sz="2"/>
+          <w:bottom w:val="single" w:color="cccccc" w:sz="2"/>
+          <w:left w:val="single" w:color="cccccc" w:sz="2"/>
+          <w:right w:val="single" w:color="cccccc" w:sz="2"/>
+        </w:pBdr>
+        <w:spacing w:after="100" w:before="0"/>
+        <w:jc w:val="center"/>
+      </w:pPr>
+      <w:r>
+        <w:drawing>
+          <wp:inline distT="0" distB="0" distL="0" distR="0">
+            <wp:extent cx="4000500" cy="2857500"/>
+            <wp:effectExtent t="0" r="0" b="0" l="0"/>
+            <wp:docPr id="1" name="" descr="" title=""/>
+            <wp:cNvGraphicFramePr>
+              <a:graphicFrameLocks xmlns:a="http://schemas.openxmlformats.org/drawingml/2006/main" noChangeAspect="1"/>
+            </wp:cNvGraphicFramePr>
+            <a:graphic xmlns:a="http://schemas.openxmlformats.org/drawingml/2006/main">
+              <a:graphicData uri="http://schemas.openxmlformats.org/drawingml/2006/picture">
+                <pic:pic xmlns:pic="http://schemas.openxmlformats.org/drawingml/2006/picture">
+                  <pic:nvPicPr>
+                    <pic:cNvPr id="0" name="" descr=""/>
+                    <pic:cNvPicPr>
+                      <a:picLocks noChangeAspect="1" noChangeArrowheads="1"/>
+                    </pic:cNvPicPr>
+                  </pic:nvPicPr>
+                  <pic:blipFill>
+                    <a:blip r:embed="rId16" cstate="none"/>
+                    <a:srcRect/>
+                    <a:stretch>
+                      <a:fillRect/>
+                    </a:stretch>
+                  </pic:blipFill>
+                  <pic:spPr bwMode="auto">
+                    <a:xfrm>
+                      <a:off x="0" y="0"/>
+                      <a:ext cx="4000500" cy="2857500"/>
+                    </a:xfrm>
+                    <a:prstGeom prst="rect">
+                      <a:avLst/>
+                    </a:prstGeom>
+                  </pic:spPr>
+                </pic:pic>
+              </a:graphicData>
+            </a:graphic>
+          </wp:inline>
+        </w:drawing>
+      </w:r>
+    </w:p>
+    <w:p>
+      <w:r>
+        <w:br w:type="page"/>
+      </w:r>
+    </w:p>
+    <w:p>
+      <w:pPr>
+        <w:spacing w:after="100" w:before="280"/>
+      </w:pPr>
+      <w:r>
+        <w:rPr>
+          <w:b/>
+          <w:bCs/>
+          <w:color w:val="2c5f8a"/>
+          <w:sz w:val="24"/>
+          <w:szCs w:val="24"/>
+        </w:rPr>
+        <w:t xml:space="preserve">Evidencia del incidente</w:t>
+      </w:r>
+    </w:p>
+    <w:p>
+      <w:pPr>
+        <w:spacing w:after="80" w:before="80"/>
+      </w:pPr>
+      <w:r>
+        <w:rPr>
+          <w:sz w:val="22"/>
+          <w:szCs w:val="22"/>
+        </w:rPr>
+        <w:t xml:space="preserve"/>
+      </w:r>
+    </w:p>
+    <w:p>
+      <w:pPr>
+        <w:spacing w:after="60" w:before="100"/>
+        <w:ind w:left="360"/>
+      </w:pPr>
+      <w:r>
+        <w:rPr>
+          <w:b/>
+          <w:bCs/>
+          <w:sz w:val="24"/>
+          <w:szCs w:val="24"/>
+        </w:rPr>
+        <w:t xml:space="preserve">☐  </w:t>
+      </w:r>
+      <w:r>
+        <w:rPr>
+          <w:sz w:val="22"/>
+          <w:szCs w:val="22"/>
+        </w:rPr>
+        <w:t xml:space="preserve">Capturas del video — láser sobre invitados bailando (min 32:36 y min 15:49)</w:t>
+      </w:r>
+    </w:p>
+    <w:p>
+      <w:pPr>
+        <w:spacing w:after="30" w:before="60"/>
+        <w:jc w:val="center"/>
+      </w:pPr>
+      <w:r>
+        <w:rPr>
+          <w:i/>
+          <w:iCs/>
+          <w:color w:val="444444"/>
+          <w:sz w:val="18"/>
+          <w:szCs w:val="18"/>
+        </w:rPr>
+        <w:t xml:space="preserve">Captura min 32:36 — láser circular del YUER sobre invitados después del vals</w:t>
+      </w:r>
+    </w:p>
+    <w:p>
+      <w:pPr>
+        <w:pBdr>
+          <w:top w:val="single" w:color="cccccc" w:sz="2"/>
+          <w:bottom w:val="single" w:color="cccccc" w:sz="2"/>
+          <w:left w:val="single" w:color="cccccc" w:sz="2"/>
+          <w:right w:val="single" w:color="cccccc" w:sz="2"/>
+        </w:pBdr>
+        <w:spacing w:after="100" w:before="0"/>
+        <w:jc w:val="center"/>
+      </w:pPr>
+      <w:r>
+        <w:drawing>
+          <wp:inline distT="0" distB="0" distL="0" distR="0">
+            <wp:extent cx="4381500" cy="2619375"/>
+            <wp:effectExtent t="0" r="0" b="0" l="0"/>
+            <wp:docPr id="1" name="" descr="" title=""/>
+            <wp:cNvGraphicFramePr>
+              <a:graphicFrameLocks xmlns:a="http://schemas.openxmlformats.org/drawingml/2006/main" noChangeAspect="1"/>
+            </wp:cNvGraphicFramePr>
+            <a:graphic xmlns:a="http://schemas.openxmlformats.org/drawingml/2006/main">
+              <a:graphicData uri="http://schemas.openxmlformats.org/drawingml/2006/picture">
+                <pic:pic xmlns:pic="http://schemas.openxmlformats.org/drawingml/2006/picture">
+                  <pic:nvPicPr>
+                    <pic:cNvPr id="0" name="" descr=""/>
+                    <pic:cNvPicPr>
+                      <a:picLocks noChangeAspect="1" noChangeArrowheads="1"/>
+                    </pic:cNvPicPr>
+                  </pic:nvPicPr>
+                  <pic:blipFill>
+                    <a:blip r:embed="rId17" cstate="none"/>
+                    <a:srcRect/>
+                    <a:stretch>
+                      <a:fillRect/>
+                    </a:stretch>
+                  </pic:blipFill>
+                  <pic:spPr bwMode="auto">
+                    <a:xfrm>
+                      <a:off x="0" y="0"/>
+                      <a:ext cx="4381500" cy="2619375"/>
+                    </a:xfrm>
+                    <a:prstGeom prst="rect">
+                      <a:avLst/>
+                    </a:prstGeom>
+                  </pic:spPr>
+                </pic:pic>
+              </a:graphicData>
+            </a:graphic>
+          </wp:inline>
+        </w:drawing>
+      </w:r>
+    </w:p>
+    <w:p>
+      <w:pPr>
+        <w:spacing w:after="80" w:before="80"/>
+      </w:pPr>
+      <w:r>
+        <w:rPr>
+          <w:sz w:val="22"/>
+          <w:szCs w:val="22"/>
+        </w:rPr>
+        <w:t xml:space="preserve"/>
+      </w:r>
+    </w:p>
+    <w:p>
+      <w:pPr>
+        <w:spacing w:after="30" w:before="60"/>
+        <w:jc w:val="center"/>
+      </w:pPr>
+      <w:r>
+        <w:rPr>
+          <w:i/>
+          <w:iCs/>
+          <w:color w:val="444444"/>
+          <w:sz w:val="18"/>
+          <w:szCs w:val="18"/>
+        </w:rPr>
+        <w:t xml:space="preserve">Captura min 15:49 — haz RGB impactando directamente a los invitados en la pista</w:t>
+      </w:r>
+    </w:p>
+    <w:p>
+      <w:pPr>
+        <w:pBdr>
+          <w:top w:val="single" w:color="cccccc" w:sz="2"/>
+          <w:bottom w:val="single" w:color="cccccc" w:sz="2"/>
+          <w:left w:val="single" w:color="cccccc" w:sz="2"/>
+          <w:right w:val="single" w:color="cccccc" w:sz="2"/>
+        </w:pBdr>
+        <w:spacing w:after="100" w:before="0"/>
+        <w:jc w:val="center"/>
+      </w:pPr>
+      <w:r>
+        <w:drawing>
+          <wp:inline distT="0" distB="0" distL="0" distR="0">
+            <wp:extent cx="4381500" cy="2857500"/>
+            <wp:effectExtent t="0" r="0" b="0" l="0"/>
+            <wp:docPr id="1" name="" descr="" title=""/>
+            <wp:cNvGraphicFramePr>
+              <a:graphicFrameLocks xmlns:a="http://schemas.openxmlformats.org/drawingml/2006/main" noChangeAspect="1"/>
+            </wp:cNvGraphicFramePr>
+            <a:graphic xmlns:a="http://schemas.openxmlformats.org/drawingml/2006/main">
+              <a:graphicData uri="http://schemas.openxmlformats.org/drawingml/2006/picture">
+                <pic:pic xmlns:pic="http://schemas.openxmlformats.org/drawingml/2006/picture">
+                  <pic:nvPicPr>
+                    <pic:cNvPr id="0" name="" descr=""/>
+                    <pic:cNvPicPr>
+                      <a:picLocks noChangeAspect="1" noChangeArrowheads="1"/>
+                    </pic:cNvPicPr>
+                  </pic:nvPicPr>
+                  <pic:blipFill>
+                    <a:blip r:embed="rId18" cstate="none"/>
+                    <a:srcRect/>
+                    <a:stretch>
+                      <a:fillRect/>
+                    </a:stretch>
+                  </pic:blipFill>
+                  <pic:spPr bwMode="auto">
+                    <a:xfrm>
+                      <a:off x="0" y="0"/>
+                      <a:ext cx="4381500" cy="2857500"/>
+                    </a:xfrm>
+                    <a:prstGeom prst="rect">
+                      <a:avLst/>
+                    </a:prstGeom>
+                  </pic:spPr>
+                </pic:pic>
+              </a:graphicData>
+            </a:graphic>
+          </wp:inline>
+        </w:drawing>
+      </w:r>
+    </w:p>
+    <w:p>
+      <w:pPr>
+        <w:spacing w:after="80" w:before="80"/>
+      </w:pPr>
+      <w:r>
+        <w:rPr>
+          <w:sz w:val="22"/>
+          <w:szCs w:val="22"/>
+        </w:rPr>
+        <w:t xml:space="preserve"/>
+      </w:r>
+    </w:p>
+    <w:p>
+      <w:pPr>
+        <w:spacing w:after="60" w:before="100"/>
+        <w:ind w:left="360"/>
+      </w:pPr>
+      <w:r>
+        <w:rPr>
+          <w:b/>
+          <w:bCs/>
+          <w:sz w:val="24"/>
+          <w:szCs w:val="24"/>
+        </w:rPr>
+        <w:t xml:space="preserve">☐  </w:t>
+      </w:r>
+      <w:r>
+        <w:rPr>
+          <w:sz w:val="22"/>
+          <w:szCs w:val="22"/>
+        </w:rPr>
+        <w:t xml:space="preserve">Capturas del láser a la altura de los chambelanes y quinceañera</w:t>
+      </w:r>
+    </w:p>
+    <w:p>
+      <w:pPr>
+        <w:spacing w:after="30" w:before="60"/>
+        <w:jc w:val="center"/>
+      </w:pPr>
+      <w:r>
+        <w:rPr>
+          <w:i/>
+          <w:iCs/>
+          <w:color w:val="444444"/>
+          <w:sz w:val="18"/>
+          <w:szCs w:val="18"/>
+        </w:rPr>
+        <w:t xml:space="preserve">Láser YUER encendido — haz visible a la altura del torso de los chambelanes</w:t>
+      </w:r>
+    </w:p>
+    <w:p>
+      <w:pPr>
+        <w:pBdr>
+          <w:top w:val="single" w:color="cccccc" w:sz="2"/>
+          <w:bottom w:val="single" w:color="cccccc" w:sz="2"/>
+          <w:left w:val="single" w:color="cccccc" w:sz="2"/>
+          <w:right w:val="single" w:color="cccccc" w:sz="2"/>
+        </w:pBdr>
+        <w:spacing w:after="100" w:before="0"/>
+        <w:jc w:val="center"/>
+      </w:pPr>
+      <w:r>
+        <w:drawing>
+          <wp:inline distT="0" distB="0" distL="0" distR="0">
+            <wp:extent cx="2667000" cy="3429000"/>
+            <wp:effectExtent t="0" r="0" b="0" l="0"/>
+            <wp:docPr id="1" name="" descr="" title=""/>
+            <wp:cNvGraphicFramePr>
+              <a:graphicFrameLocks xmlns:a="http://schemas.openxmlformats.org/drawingml/2006/main" noChangeAspect="1"/>
+            </wp:cNvGraphicFramePr>
+            <a:graphic xmlns:a="http://schemas.openxmlformats.org/drawingml/2006/main">
+              <a:graphicData uri="http://schemas.openxmlformats.org/drawingml/2006/picture">
+                <pic:pic xmlns:pic="http://schemas.openxmlformats.org/drawingml/2006/picture">
+                  <pic:nvPicPr>
+                    <pic:cNvPr id="0" name="" descr=""/>
+                    <pic:cNvPicPr>
+                      <a:picLocks noChangeAspect="1" noChangeArrowheads="1"/>
+                    </pic:cNvPicPr>
+                  </pic:nvPicPr>
+                  <pic:blipFill>
+                    <a:blip r:embed="rId19" cstate="none"/>
+                    <a:srcRect/>
+                    <a:stretch>
+                      <a:fillRect/>
+                    </a:stretch>
+                  </pic:blipFill>
+                  <pic:spPr bwMode="auto">
+                    <a:xfrm>
+                      <a:off x="0" y="0"/>
+                      <a:ext cx="2667000" cy="3429000"/>
+                    </a:xfrm>
+                    <a:prstGeom prst="rect">
+                      <a:avLst/>
+                    </a:prstGeom>
+                  </pic:spPr>
+                </pic:pic>
+              </a:graphicData>
+            </a:graphic>
+          </wp:inline>
+        </w:drawing>
+      </w:r>
+    </w:p>
+    <w:p>
+      <w:pPr>
+        <w:spacing w:after="80" w:before="80"/>
+      </w:pPr>
+      <w:r>
+        <w:rPr>
+          <w:sz w:val="22"/>
+          <w:szCs w:val="22"/>
+        </w:rPr>
+        <w:t xml:space="preserve"/>
+      </w:r>
+    </w:p>
+    <w:p>
+      <w:pPr>
+        <w:spacing w:after="30" w:before="60"/>
+        <w:jc w:val="center"/>
+      </w:pPr>
+      <w:r>
+        <w:rPr>
+          <w:i/>
+          <w:iCs/>
+          <w:color w:val="444444"/>
+          <w:sz w:val="18"/>
+          <w:szCs w:val="18"/>
+        </w:rPr>
+        <w:t xml:space="preserve">Chambelán elevando a la quinceañera — láser YUER a centímetros de su espalda</w:t>
+      </w:r>
+    </w:p>
+    <w:p>
+      <w:pPr>
+        <w:pBdr>
+          <w:top w:val="single" w:color="cccccc" w:sz="2"/>
+          <w:bottom w:val="single" w:color="cccccc" w:sz="2"/>
+          <w:left w:val="single" w:color="cccccc" w:sz="2"/>
+          <w:right w:val="single" w:color="cccccc" w:sz="2"/>
+        </w:pBdr>
+        <w:spacing w:after="100" w:before="0"/>
+        <w:jc w:val="center"/>
+      </w:pPr>
+      <w:r>
+        <w:drawing>
+          <wp:inline distT="0" distB="0" distL="0" distR="0">
+            <wp:extent cx="2476500" cy="3810000"/>
+            <wp:effectExtent t="0" r="0" b="0" l="0"/>
+            <wp:docPr id="1" name="" descr="" title=""/>
+            <wp:cNvGraphicFramePr>
+              <a:graphicFrameLocks xmlns:a="http://schemas.openxmlformats.org/drawingml/2006/main" noChangeAspect="1"/>
+            </wp:cNvGraphicFramePr>
+            <a:graphic xmlns:a="http://schemas.openxmlformats.org/drawingml/2006/main">
+              <a:graphicData uri="http://schemas.openxmlformats.org/drawingml/2006/picture">
+                <pic:pic xmlns:pic="http://schemas.openxmlformats.org/drawingml/2006/picture">
+                  <pic:nvPicPr>
+                    <pic:cNvPr id="0" name="" descr=""/>
+                    <pic:cNvPicPr>
+                      <a:picLocks noChangeAspect="1" noChangeArrowheads="1"/>
+                    </pic:cNvPicPr>
+                  </pic:nvPicPr>
+                  <pic:blipFill>
+                    <a:blip r:embed="rId20" cstate="none"/>
+                    <a:srcRect/>
+                    <a:stretch>
+                      <a:fillRect/>
+                    </a:stretch>
+                  </pic:blipFill>
+                  <pic:spPr bwMode="auto">
+                    <a:xfrm>
+                      <a:off x="0" y="0"/>
+                      <a:ext cx="2476500" cy="3810000"/>
+                    </a:xfrm>
+                    <a:prstGeom prst="rect">
+                      <a:avLst/>
+                    </a:prstGeom>
+                  </pic:spPr>
+                </pic:pic>
+              </a:graphicData>
+            </a:graphic>
+          </wp:inline>
+        </w:drawing>
+      </w:r>
+    </w:p>
+    <w:p>
+      <w:pPr>
+        <w:spacing w:after="80" w:before="80"/>
+      </w:pPr>
+      <w:r>
+        <w:rPr>
+          <w:sz w:val="22"/>
+          <w:szCs w:val="22"/>
+        </w:rPr>
+        <w:t xml:space="preserve"/>
+      </w:r>
+    </w:p>
+    <w:p>
+      <w:pPr>
+        <w:spacing w:after="60" w:before="100"/>
+        <w:ind w:left="360"/>
+      </w:pPr>
+      <w:r>
+        <w:rPr>
+          <w:b/>
+          <w:bCs/>
+          <w:sz w:val="24"/>
+          <w:szCs w:val="24"/>
+        </w:rPr>
+        <w:t xml:space="preserve">☐  </w:t>
+      </w:r>
+      <w:r>
+        <w:rPr>
+          <w:sz w:val="22"/>
+          <w:szCs w:val="22"/>
+        </w:rPr>
+        <w:t xml:space="preserve">Zoom unidad láser — se lee la marca "YUE" = YUER</w:t>
+      </w:r>
+    </w:p>
+    <w:p>
+      <w:pPr>
+        <w:spacing w:after="30" w:before="60"/>
+        <w:jc w:val="center"/>
+      </w:pPr>
+      <w:r>
+        <w:rPr>
+          <w:i/>
+          <w:iCs/>
+          <w:color w:val="444444"/>
+          <w:sz w:val="18"/>
+          <w:szCs w:val="18"/>
+        </w:rPr>
+        <w:t xml:space="preserve">Zoom sobre la unidad: se lee "YUE" = marca YUER, modelo RGB 10W</w:t>
+      </w:r>
+    </w:p>
+    <w:p>
+      <w:pPr>
+        <w:pBdr>
+          <w:top w:val="single" w:color="cccccc" w:sz="2"/>
+          <w:bottom w:val="single" w:color="cccccc" w:sz="2"/>
+          <w:left w:val="single" w:color="cccccc" w:sz="2"/>
+          <w:right w:val="single" w:color="cccccc" w:sz="2"/>
+        </w:pBdr>
+        <w:spacing w:after="100" w:before="0"/>
+        <w:jc w:val="center"/>
+      </w:pPr>
+      <w:r>
+        <w:drawing>
+          <wp:inline distT="0" distB="0" distL="0" distR="0">
+            <wp:extent cx="3810000" cy="2857500"/>
+            <wp:effectExtent t="0" r="0" b="0" l="0"/>
+            <wp:docPr id="1" name="" descr="" title=""/>
+            <wp:cNvGraphicFramePr>
+              <a:graphicFrameLocks xmlns:a="http://schemas.openxmlformats.org/drawingml/2006/main" noChangeAspect="1"/>
+            </wp:cNvGraphicFramePr>
+            <a:graphic xmlns:a="http://schemas.openxmlformats.org/drawingml/2006/main">
+              <a:graphicData uri="http://schemas.openxmlformats.org/drawingml/2006/picture">
+                <pic:pic xmlns:pic="http://schemas.openxmlformats.org/drawingml/2006/picture">
+                  <pic:nvPicPr>
+                    <pic:cNvPr id="0" name="" descr=""/>
+                    <pic:cNvPicPr>
+                      <a:picLocks noChangeAspect="1" noChangeArrowheads="1"/>
+                    </pic:cNvPicPr>
+                  </pic:nvPicPr>
+                  <pic:blipFill>
+                    <a:blip r:embed="rId21" cstate="none"/>
+                    <a:srcRect/>
+                    <a:stretch>
+                      <a:fillRect/>
+                    </a:stretch>
+                  </pic:blipFill>
+                  <pic:spPr bwMode="auto">
+                    <a:xfrm>
+                      <a:off x="0" y="0"/>
+                      <a:ext cx="3810000" cy="2857500"/>
+                    </a:xfrm>
+                    <a:prstGeom prst="rect">
+                      <a:avLst/>
+                    </a:prstGeom>
+                  </pic:spPr>
+                </pic:pic>
+              </a:graphicData>
+            </a:graphic>
+          </wp:inline>
+        </w:drawing>
+      </w:r>
+    </w:p>
+    <w:p>
+      <w:pPr>
+        <w:spacing w:after="80" w:before="80"/>
+      </w:pPr>
+      <w:r>
+        <w:rPr>
+          <w:sz w:val="22"/>
+          <w:szCs w:val="22"/>
+        </w:rPr>
+        <w:t xml:space="preserve"/>
+      </w:r>
+    </w:p>
+    <w:p>
+      <w:pPr>
+        <w:spacing w:after="60" w:before="100"/>
+        <w:ind w:left="360"/>
+      </w:pPr>
+      <w:r>
+        <w:rPr>
+          <w:b/>
+          <w:bCs/>
+          <w:sz w:val="24"/>
+          <w:szCs w:val="24"/>
+        </w:rPr>
+        <w:t xml:space="preserve">☐  </w:t>
+      </w:r>
+      <w:r>
+        <w:rPr>
+          <w:sz w:val="22"/>
+          <w:szCs w:val="22"/>
+        </w:rPr>
+        <w:t xml:space="preserve">USB o teléfono con el video del momento exacto del daño</w:t>
       </w:r>
       <w:r>
         <w:rPr>
@@ -1332,7 +2462,23 @@
           <w:sz w:val="20"/>
           <w:szCs w:val="20"/>
         </w:rPr>
-        <w:t xml:space="preserve">  (imprimir portada o llevar en celular)</w:t>
+        <w:t xml:space="preserve">   (opcional pero muy recomendado)</w:t>
+      </w:r>
+    </w:p>
+    <w:p>
+      <w:pPr>
+        <w:spacing w:after="180" w:before="0"/>
+        <w:jc w:val="center"/>
+      </w:pPr>
+      <w:r>
+        <w:rPr>
+          <w:i/>
+          <w:iCs/>
+          <w:color w:val="555555"/>
+          <w:sz w:val="18"/>
+          <w:szCs w:val="18"/>
+        </w:rPr>
+        <w:t xml:space="preserve">📌 Llevar el video original en teléfono o USB para mostrar en el juzgado si se solicita</w:t>
       </w:r>
     </w:p>
     <w:p>
@@ -1349,31 +2495,16 @@
     </w:p>
     <w:p>
       <w:pPr>
-        <w:spacing w:after="120" w:before="280"/>
-      </w:pPr>
-      <w:r>
-        <w:rPr>
-          <w:b/>
-          <w:bCs/>
-          <w:color w:val="2c5f8a"/>
+        <w:spacing w:after="60" w:before="100"/>
+        <w:ind w:left="360"/>
+      </w:pPr>
+      <w:r>
+        <w:rPr>
+          <w:b/>
+          <w:bCs/>
           <w:sz w:val="24"/>
           <w:szCs w:val="24"/>
         </w:rPr>
-        <w:t xml:space="preserve">Escrito de demanda</w:t>
-      </w:r>
-    </w:p>
-    <w:p>
-      <w:pPr>
-        <w:spacing w:after="80" w:before="80"/>
-        <w:ind w:left="360"/>
-      </w:pPr>
-      <w:r>
-        <w:rPr>
-          <w:b/>
-          <w:bCs/>
-          <w:sz w:val="22"/>
-          <w:szCs w:val="22"/>
-        </w:rPr>
         <w:t xml:space="preserve">☐  </w:t>
       </w:r>
       <w:r>
@@ -1381,7 +2512,7 @@
           <w:sz w:val="22"/>
           <w:szCs w:val="22"/>
         </w:rPr>
-        <w:t xml:space="preserve">Escrito de demanda civil (Sección 4 de este expediente)</w:t>
+        <w:t xml:space="preserve">URL del sitio de evidencias: https://caso-laser.invitados.org</w:t>
       </w:r>
       <w:r>
         <w:rPr>
@@ -1391,61 +2522,23 @@
           <w:sz w:val="20"/>
           <w:szCs w:val="20"/>
         </w:rPr>
-        <w:t xml:space="preserve">  (presentar en 3 tantos)</w:t>
-      </w:r>
-    </w:p>
-    <w:p>
-      <w:pPr>
-        <w:spacing w:after="80" w:before="80"/>
-        <w:ind w:left="360"/>
-      </w:pPr>
-      <w:r>
-        <w:rPr>
-          <w:b/>
-          <w:bCs/>
-          <w:sz w:val="22"/>
-          <w:szCs w:val="22"/>
-        </w:rPr>
-        <w:t xml:space="preserve">☐  </w:t>
-      </w:r>
-      <w:r>
-        <w:rPr>
-          <w:sz w:val="22"/>
-          <w:szCs w:val="22"/>
-        </w:rPr>
-        <w:t xml:space="preserve">INE / IFE vigente</w:t>
-      </w:r>
+        <w:t xml:space="preserve">   (imprimir portada o llevar en celular)</w:t>
+      </w:r>
+    </w:p>
+    <w:p>
+      <w:pPr>
+        <w:spacing w:after="180" w:before="0"/>
+        <w:jc w:val="center"/>
+      </w:pPr>
       <w:r>
         <w:rPr>
           <w:i/>
           <w:iCs/>
-          <w:color w:val="888888"/>
-          <w:sz w:val="20"/>
-          <w:szCs w:val="20"/>
-        </w:rPr>
-        <w:t xml:space="preserve">  (original + 2 copias)</w:t>
-      </w:r>
-    </w:p>
-    <w:p>
-      <w:pPr>
-        <w:spacing w:after="80" w:before="80"/>
-        <w:ind w:left="360"/>
-      </w:pPr>
-      <w:r>
-        <w:rPr>
-          <w:b/>
-          <w:bCs/>
-          <w:sz w:val="22"/>
-          <w:szCs w:val="22"/>
-        </w:rPr>
-        <w:t xml:space="preserve">☐  </w:t>
-      </w:r>
-      <w:r>
-        <w:rPr>
-          <w:sz w:val="22"/>
-          <w:szCs w:val="22"/>
-        </w:rPr>
-        <w:t xml:space="preserve">CURP impresa</w:t>
+          <w:color w:val="555555"/>
+          <w:sz w:val="18"/>
+          <w:szCs w:val="18"/>
+        </w:rPr>
+        <w:t xml:space="preserve">📌 El sitio contiene cronología completa, todas las evidencias y el fundamento legal</w:t>
       </w:r>
     </w:p>
     <w:p>
@@ -1459,7 +2552,7 @@
         <w:pBdr>
           <w:bottom w:val="single" w:color="1a3a5c" w:sz="6"/>
         </w:pBdr>
-        <w:spacing w:after="200" w:before="400"/>
+        <w:spacing w:after="180" w:before="400"/>
       </w:pPr>
       <w:r>
         <w:rPr>
@@ -1628,7 +2721,7 @@
                 <w:sz w:val="22"/>
                 <w:szCs w:val="22"/>
               </w:rPr>
-              <w:t xml:space="preserve">Reunión con gerente + WhatsApp con caso a Fernanda</w:t>
+              <w:t xml:space="preserve">Reunión gerente + WhatsApp a Fernanda con caso</w:t>
             </w:r>
           </w:p>
         </w:tc>
@@ -1733,7 +2826,7 @@
                 <w:sz w:val="22"/>
                 <w:szCs w:val="22"/>
               </w:rPr>
-              <w:t xml:space="preserve">WhatsApp: inicio de demanda + oferta de conciliación</w:t>
+              <w:t xml:space="preserve">WhatsApp: inicio de demanda + oferta conciliación</w:t>
             </w:r>
           </w:p>
         </w:tc>
@@ -1761,7 +2854,7 @@
         <w:pBdr>
           <w:bottom w:val="single" w:color="1a3a5c" w:sz="6"/>
         </w:pBdr>
-        <w:spacing w:after="200" w:before="400"/>
+        <w:spacing w:after="180" w:before="400"/>
       </w:pPr>
       <w:r>
         <w:rPr>
@@ -1803,7 +2896,7 @@
     </w:p>
     <w:p>
       <w:pPr>
-        <w:spacing w:after="300"/>
+        <w:spacing w:after="250"/>
         <w:jc w:val="center"/>
       </w:pPr>
       <w:r>
@@ -1818,7 +2911,7 @@
     </w:p>
     <w:p>
       <w:pPr>
-        <w:spacing w:after="80" w:before="80"/>
+        <w:spacing w:after="60" w:before="60"/>
         <w:ind/>
         <w:jc w:val="both"/>
       </w:pPr>
@@ -1827,7 +2920,7 @@
           <w:sz w:val="22"/>
           <w:szCs w:val="22"/>
         </w:rPr>
-        <w:t xml:space="preserve">Arturo Cruz, por propio derecho, señalando como domicilio para oír y recibir notificaciones el ubicado en León, Guanajuato, con WhatsApp 477-920-3776 y correo foro7.arturocruz@gmail.com, ante usted con el debido respeto comparezco y expongo:</w:t>
+        <w:t xml:space="preserve">Arturo Cruz, por propio derecho, señalando como domicilio para oír y recibir notificaciones el ubicado en León, Guanajuato, con WhatsApp 477-920-3776 y correo foro7.arturocruz@gmail.com, ante usted comparezco y expongo:</w:t>
       </w:r>
     </w:p>
     <w:p>
@@ -1844,7 +2937,7 @@
     </w:p>
     <w:p>
       <w:pPr>
-        <w:spacing w:after="120" w:before="280"/>
+        <w:spacing w:after="100" w:before="280"/>
       </w:pPr>
       <w:r>
         <w:rPr>
@@ -1859,7 +2952,7 @@
     </w:p>
     <w:p>
       <w:pPr>
-        <w:spacing w:after="80" w:before="80"/>
+        <w:spacing w:after="60" w:before="60"/>
         <w:ind/>
         <w:jc w:val="both"/>
       </w:pPr>
@@ -1868,12 +2961,12 @@
           <w:sz w:val="22"/>
           <w:szCs w:val="22"/>
         </w:rPr>
-        <w:t xml:space="preserve">Con fundamento en los artículos 1910 y 1930 del Código Civil para el Estado de Guanajuato, vengo a demandar en la VÍA ORDINARIA CIVIL a SALÓN EXTRAVAGANZA, con domicilio en Blvd. Mariano Escobedo Ote. #4821, Cd Satélite, León, Guanajuato, las siguientes prestaciones:</w:t>
-      </w:r>
-    </w:p>
-    <w:p>
-      <w:pPr>
-        <w:spacing w:after="80" w:before="80"/>
+        <w:t xml:space="preserve">Con fundamento en los artículos 1910 y 1930 del Código Civil para el Estado de Guanajuato, vengo a demandar en la VÍA ORDINARIA CIVIL a SALÓN EXTRAVAGANZA, con domicilio en Blvd. Mariano Escobedo Ote. #4821, Cd Satélite, León, Gto., las siguientes prestaciones:</w:t>
+      </w:r>
+    </w:p>
+    <w:p>
+      <w:pPr>
+        <w:spacing w:after="60" w:before="60"/>
         <w:ind w:left="720"/>
         <w:jc w:val="both"/>
       </w:pPr>
@@ -1882,12 +2975,12 @@
           <w:sz w:val="22"/>
           <w:szCs w:val="22"/>
         </w:rPr>
-        <w:t xml:space="preserve">A)  $9,199.00 MXN — Reemplazo del equipo DJI Osmo Pocket 3 dañado de forma permanente e irreparable.</w:t>
-      </w:r>
-    </w:p>
-    <w:p>
-      <w:pPr>
-        <w:spacing w:after="80" w:before="80"/>
+        <w:t xml:space="preserve">A)  $9,199.00 MXN — Reemplazo del equipo DJI Osmo Pocket 3 dañado.</w:t>
+      </w:r>
+    </w:p>
+    <w:p>
+      <w:pPr>
+        <w:spacing w:after="60" w:before="60"/>
         <w:ind w:left="720"/>
         <w:jc w:val="both"/>
       </w:pPr>
@@ -1896,12 +2989,12 @@
           <w:sz w:val="22"/>
           <w:szCs w:val="22"/>
         </w:rPr>
-        <w:t xml:space="preserve">B)  $8,000.00 MXN — Afectación al servicio de video profesional contratado (XV Años Jade Ramos).</w:t>
-      </w:r>
-    </w:p>
-    <w:p>
-      <w:pPr>
-        <w:spacing w:after="80" w:before="80"/>
+        <w:t xml:space="preserve">B)  $8,000.00 MXN — Afectación al servicio de video profesional (XV Años Jade Ramos).</w:t>
+      </w:r>
+    </w:p>
+    <w:p>
+      <w:pPr>
+        <w:spacing w:after="60" w:before="60"/>
         <w:ind w:left="720"/>
         <w:jc w:val="both"/>
       </w:pPr>
@@ -1910,12 +3003,12 @@
           <w:sz w:val="22"/>
           <w:szCs w:val="22"/>
         </w:rPr>
-        <w:t xml:space="preserve">C)  $3,500.00 MXN — Gastos de transporte, documentación y tiempo invertido en gestiones.</w:t>
-      </w:r>
-    </w:p>
-    <w:p>
-      <w:pPr>
-        <w:spacing w:after="80" w:before="80"/>
+        <w:t xml:space="preserve">C)  $3,500.00 MXN — Gastos de transporte, documentación y tiempo en gestiones.</w:t>
+      </w:r>
+    </w:p>
+    <w:p>
+      <w:pPr>
+        <w:spacing w:after="60" w:before="60"/>
         <w:ind w:left="720"/>
         <w:jc w:val="both"/>
       </w:pPr>
@@ -1924,12 +3017,12 @@
           <w:sz w:val="22"/>
           <w:szCs w:val="22"/>
         </w:rPr>
-        <w:t xml:space="preserve">D)  $10,000.00 MXN — Daño moral causado al patrimonio y reputación profesional de Producciones Foro 7.</w:t>
-      </w:r>
-    </w:p>
-    <w:p>
-      <w:pPr>
-        <w:spacing w:after="80" w:before="80"/>
+        <w:t xml:space="preserve">D)  $10,000.00 MXN — Daño moral a la reputación profesional de Producciones Foro 7.</w:t>
+      </w:r>
+    </w:p>
+    <w:p>
+      <w:pPr>
+        <w:spacing w:after="60" w:before="60"/>
         <w:ind w:left="720"/>
         <w:jc w:val="both"/>
       </w:pPr>
@@ -1938,7 +3031,7 @@
           <w:sz w:val="22"/>
           <w:szCs w:val="22"/>
         </w:rPr>
-        <w:t xml:space="preserve">E)  Pago de costas y gastos del juicio.</w:t>
+        <w:t xml:space="preserve">E)  Costas y gastos del juicio.</w:t>
       </w:r>
     </w:p>
     <w:p>
@@ -1955,17 +3048,17 @@
     </w:p>
     <w:p>
       <w:pPr>
-        <w:spacing w:after="150" w:before="150"/>
-        <w:jc w:val="center"/>
-      </w:pPr>
-      <w:r>
-        <w:rPr>
-          <w:b/>
-          <w:bCs/>
-          <w:sz w:val="24"/>
-          <w:szCs w:val="24"/>
-        </w:rPr>
-        <w:t xml:space="preserve">TOTAL RECLAMADO: $30,699.00 MXN (TREINTA MIL SEISCIENTOS NOVENTA Y NUEVE PESOS 00/100 MN)</w:t>
+        <w:spacing w:after="120" w:before="120"/>
+        <w:jc w:val="center"/>
+      </w:pPr>
+      <w:r>
+        <w:rPr>
+          <w:b/>
+          <w:bCs/>
+          <w:sz w:val="26"/>
+          <w:szCs w:val="26"/>
+        </w:rPr>
+        <w:t xml:space="preserve">TOTAL: $30,699.00 MXN</w:t>
       </w:r>
     </w:p>
     <w:p>
@@ -1982,7 +3075,7 @@
     </w:p>
     <w:p>
       <w:pPr>
-        <w:spacing w:after="120" w:before="280"/>
+        <w:spacing w:after="100" w:before="280"/>
       </w:pPr>
       <w:r>
         <w:rPr>
@@ -1997,7 +3090,7 @@
     </w:p>
     <w:p>
       <w:pPr>
-        <w:spacing w:after="80" w:before="80"/>
+        <w:spacing w:after="60" w:before="60"/>
         <w:ind w:left="720"/>
         <w:jc w:val="both"/>
       </w:pPr>
@@ -2006,12 +3099,12 @@
           <w:sz w:val="22"/>
           <w:szCs w:val="22"/>
         </w:rPr>
-        <w:t xml:space="preserve">1. El 14 de febrero de 2026, durante la celebración de XV Años de Jade Ramos en el Salón Extravaganza, León, Gto., el láser operado por el establecimiento (YUER RGB 10W Clase IV, modelo YROYLL10WRGB-XLR-RJ45-EU) proyectaba texto a una altura de 1 a 3 metros en zona de tránsito, sin señalización ni medidas de seguridad.</w:t>
-      </w:r>
-    </w:p>
-    <w:p>
-      <w:pPr>
-        <w:spacing w:after="80" w:before="80"/>
+        <w:t xml:space="preserve">1. El 14 de febrero de 2026, el láser YUER RGB 10W Clase IV del Salón Extravaganza operaba sin medidas de seguridad a altura de 1–3 m en zona de tránsito durante XV Años de Jade Ramos.</w:t>
+      </w:r>
+    </w:p>
+    <w:p>
+      <w:pPr>
+        <w:spacing w:after="60" w:before="60"/>
         <w:ind w:left="720"/>
         <w:jc w:val="both"/>
       </w:pPr>
@@ -2020,12 +3113,12 @@
           <w:sz w:val="22"/>
           <w:szCs w:val="22"/>
         </w:rPr>
-        <w:t xml:space="preserve">2. El rayo láser impactó directamente el sensor CMOS de la cámara DJI Osmo Pocket 3 (serie: 5WTZM9C002CVXL), causando daño permanente e irreparable visible como marcas permanentes en toda grabación posterior.</w:t>
-      </w:r>
-    </w:p>
-    <w:p>
-      <w:pPr>
-        <w:spacing w:after="80" w:before="80"/>
+        <w:t xml:space="preserve">2. El rayo láser impactó directamente el sensor CMOS de la cámara DJI Osmo Pocket 3 (serie 5WTZM9C002CVXL) causando daño permanente e irreparable.</w:t>
+      </w:r>
+    </w:p>
+    <w:p>
+      <w:pPr>
+        <w:spacing w:after="60" w:before="60"/>
         <w:ind w:left="720"/>
         <w:jc w:val="both"/>
       </w:pPr>
@@ -2034,12 +3127,12 @@
           <w:sz w:val="22"/>
           <w:szCs w:val="22"/>
         </w:rPr>
-        <w:t xml:space="preserve">3. DJI confirmó que no existe cobertura de reparación de sensor para este modelo en México (portal oficial: "Este servicio no tiene cobertura para este producto").</w:t>
-      </w:r>
-    </w:p>
-    <w:p>
-      <w:pPr>
-        <w:spacing w:after="80" w:before="80"/>
+        <w:t xml:space="preserve">3. DJI confirmó que no existe cobertura de reparación de sensor para este modelo en México.</w:t>
+      </w:r>
+    </w:p>
+    <w:p>
+      <w:pPr>
+        <w:spacing w:after="60" w:before="60"/>
         <w:ind w:left="720"/>
         <w:jc w:val="both"/>
       </w:pPr>
@@ -2048,12 +3141,12 @@
           <w:sz w:val="22"/>
           <w:szCs w:val="22"/>
         </w:rPr>
-        <w:t xml:space="preserve">4. El daño afectó también el servicio de video profesional contratado ($8,000 MXN), comprometiendo el material entregable y la reputación de Producciones Foro 7.</w:t>
-      </w:r>
-    </w:p>
-    <w:p>
-      <w:pPr>
-        <w:spacing w:after="80" w:before="80"/>
+        <w:t xml:space="preserve">4. El daño afectó el servicio de video contratado ($8,000 MXN) y la reputación de Producciones Foro 7.</w:t>
+      </w:r>
+    </w:p>
+    <w:p>
+      <w:pPr>
+        <w:spacing w:after="60" w:before="60"/>
         <w:ind w:left="720"/>
         <w:jc w:val="both"/>
       </w:pPr>
@@ -2062,12 +3155,12 @@
           <w:sz w:val="22"/>
           <w:szCs w:val="22"/>
         </w:rPr>
-        <w:t xml:space="preserve">5. El 16 de febrero de 2026, el gerente del salón se negó a asumir responsabilidad. El 18 de febrero se envió carta formal (Caso FORO7-2026-001) sin obtener respuesta. Los seguimientos del 21 de febrero y marzo de 2026 también fueron ignorados.</w:t>
-      </w:r>
-    </w:p>
-    <w:p>
-      <w:pPr>
-        <w:spacing w:after="80" w:before="80"/>
+        <w:t xml:space="preserve">5. El gerente del salón negó responsabilidad el 16 feb. La carta formal del 18 feb y seguimientos del 21 feb y marzo 2026 fueron ignorados.</w:t>
+      </w:r>
+    </w:p>
+    <w:p>
+      <w:pPr>
+        <w:spacing w:after="60" w:before="60"/>
         <w:ind w:left="720"/>
         <w:jc w:val="both"/>
       </w:pPr>
@@ -2076,7 +3169,7 @@
           <w:sz w:val="22"/>
           <w:szCs w:val="22"/>
         </w:rPr>
-        <w:t xml:space="preserve">6. Las evidencias documentadas muestran que el láser apuntaba directamente a la cara y cuerpo de los chambelanes (menores de edad) y de la quinceañera durante el vals, representando riesgo grave a la salud visual.</w:t>
+        <w:t xml:space="preserve">6. El láser apuntaba a la cara y cuerpo de chambelanes (menores de edad) y la quinceañera durante el vals, constituyendo riesgo grave a la salud visual.</w:t>
       </w:r>
     </w:p>
     <w:p>
@@ -2093,7 +3186,7 @@
     </w:p>
     <w:p>
       <w:pPr>
-        <w:spacing w:after="120" w:before="280"/>
+        <w:spacing w:after="100" w:before="280"/>
       </w:pPr>
       <w:r>
         <w:rPr>
@@ -2108,7 +3201,7 @@
     </w:p>
     <w:p>
       <w:pPr>
-        <w:spacing w:after="80" w:before="80"/>
+        <w:spacing w:after="60" w:before="60"/>
         <w:ind w:left="720"/>
         <w:jc w:val="both"/>
       </w:pPr>
@@ -2117,12 +3210,12 @@
           <w:sz w:val="22"/>
           <w:szCs w:val="22"/>
         </w:rPr>
-        <w:t xml:space="preserve">• Arts. 1910 y 1930 CCEG — Responsabilidad civil por daños causados a terceros.</w:t>
-      </w:r>
-    </w:p>
-    <w:p>
-      <w:pPr>
-        <w:spacing w:after="80" w:before="80"/>
+        <w:t xml:space="preserve">• Arts. 1910 y 1930 CCEG — Responsabilidad civil por daños a terceros.</w:t>
+      </w:r>
+    </w:p>
+    <w:p>
+      <w:pPr>
+        <w:spacing w:after="60" w:before="60"/>
         <w:ind w:left="720"/>
         <w:jc w:val="both"/>
       </w:pPr>
@@ -2131,12 +3224,12 @@
           <w:sz w:val="22"/>
           <w:szCs w:val="22"/>
         </w:rPr>
-        <w:t xml:space="preserve">• IEC 60825-1 — Láseres Clase IV requieren zonas de exclusión, señalización y operador certificado.</w:t>
-      </w:r>
-    </w:p>
-    <w:p>
-      <w:pPr>
-        <w:spacing w:after="80" w:before="80"/>
+        <w:t xml:space="preserve">• IEC 60825-1 — Láseres Clase IV requieren zonas de exclusión y operador certificado.</w:t>
+      </w:r>
+    </w:p>
+    <w:p>
+      <w:pPr>
+        <w:spacing w:after="60" w:before="60"/>
         <w:ind w:left="720"/>
         <w:jc w:val="both"/>
       </w:pPr>
@@ -2162,7 +3255,7 @@
     </w:p>
     <w:p>
       <w:pPr>
-        <w:spacing w:after="120" w:before="280"/>
+        <w:spacing w:after="100" w:before="280"/>
       </w:pPr>
       <w:r>
         <w:rPr>
@@ -2177,7 +3270,7 @@
     </w:p>
     <w:p>
       <w:pPr>
-        <w:spacing w:after="80" w:before="80"/>
+        <w:spacing w:after="60" w:before="60"/>
         <w:ind w:left="720"/>
         <w:jc w:val="both"/>
       </w:pPr>
@@ -2191,7 +3284,7 @@
     </w:p>
     <w:p>
       <w:pPr>
-        <w:spacing w:after="80" w:before="80"/>
+        <w:spacing w:after="60" w:before="60"/>
         <w:ind w:left="720"/>
         <w:jc w:val="both"/>
       </w:pPr>
@@ -2200,12 +3293,12 @@
           <w:sz w:val="22"/>
           <w:szCs w:val="22"/>
         </w:rPr>
-        <w:t xml:space="preserve">2. Portal DJI: rechazo de cobertura de reparación, serie 5WTZM9C002CVXL.</w:t>
-      </w:r>
-    </w:p>
-    <w:p>
-      <w:pPr>
-        <w:spacing w:after="80" w:before="80"/>
+        <w:t xml:space="preserve">2. Portal DJI: rechazo de cobertura, serie 5WTZM9C002CVXL.</w:t>
+      </w:r>
+    </w:p>
+    <w:p>
+      <w:pPr>
+        <w:spacing w:after="60" w:before="60"/>
         <w:ind w:left="720"/>
         <w:jc w:val="both"/>
       </w:pPr>
@@ -2214,12 +3307,12 @@
           <w:sz w:val="22"/>
           <w:szCs w:val="22"/>
         </w:rPr>
-        <w:t xml:space="preserve">3. Carta formal de reclamación enviada el 18-feb-2026 con acuse de correo.</w:t>
-      </w:r>
-    </w:p>
-    <w:p>
-      <w:pPr>
-        <w:spacing w:after="80" w:before="80"/>
+        <w:t xml:space="preserve">3. Carta formal FORO7-2026-001 enviada el 18-feb-2026.</w:t>
+      </w:r>
+    </w:p>
+    <w:p>
+      <w:pPr>
+        <w:spacing w:after="60" w:before="60"/>
         <w:ind w:left="720"/>
         <w:jc w:val="both"/>
       </w:pPr>
@@ -2228,12 +3321,12 @@
           <w:sz w:val="22"/>
           <w:szCs w:val="22"/>
         </w:rPr>
-        <w:t xml:space="preserve">4. Capturas de WhatsApp: contacto 16, 21 feb y marzo 2026, todos sin respuesta.</w:t>
-      </w:r>
-    </w:p>
-    <w:p>
-      <w:pPr>
-        <w:spacing w:after="80" w:before="80"/>
+        <w:t xml:space="preserve">4. Capturas de WhatsApp: 16, 21 feb y marzo 2026 — todos sin respuesta.</w:t>
+      </w:r>
+    </w:p>
+    <w:p>
+      <w:pPr>
+        <w:spacing w:after="60" w:before="60"/>
         <w:ind w:left="720"/>
         <w:jc w:val="both"/>
       </w:pPr>
@@ -2242,12 +3335,12 @@
           <w:sz w:val="22"/>
           <w:szCs w:val="22"/>
         </w:rPr>
-        <w:t xml:space="preserve">5. Fotografías del láser YUER en operación y del haz a la altura de los chambelanes.</w:t>
-      </w:r>
-    </w:p>
-    <w:p>
-      <w:pPr>
-        <w:spacing w:after="80" w:before="80"/>
+        <w:t xml:space="preserve">5. Fotografías del láser YUER en operación y del haz sobre los chambelanes.</w:t>
+      </w:r>
+    </w:p>
+    <w:p>
+      <w:pPr>
+        <w:spacing w:after="60" w:before="60"/>
         <w:ind w:left="720"/>
         <w:jc w:val="both"/>
       </w:pPr>
@@ -2256,12 +3349,12 @@
           <w:sz w:val="22"/>
           <w:szCs w:val="22"/>
         </w:rPr>
-        <w:t xml:space="preserve">6. Fotografía del patrón de daño permanente en el sensor CMOS.</w:t>
-      </w:r>
-    </w:p>
-    <w:p>
-      <w:pPr>
-        <w:spacing w:after="80" w:before="80"/>
+        <w:t xml:space="preserve">6. Fotografía del patrón de daño permanente en sensor CMOS.</w:t>
+      </w:r>
+    </w:p>
+    <w:p>
+      <w:pPr>
+        <w:spacing w:after="60" w:before="60"/>
         <w:ind w:left="720"/>
         <w:jc w:val="both"/>
       </w:pPr>
@@ -2270,7 +3363,7 @@
           <w:sz w:val="22"/>
           <w:szCs w:val="22"/>
         </w:rPr>
-        <w:t xml:space="preserve">7. Sitio web público con expediente completo: https://caso-laser.invitados.org</w:t>
+        <w:t xml:space="preserve">7. Expediente público: https://caso-laser.invitados.org</w:t>
       </w:r>
     </w:p>
     <w:p>
@@ -2287,7 +3380,7 @@
     </w:p>
     <w:p>
       <w:pPr>
-        <w:spacing w:after="120" w:before="280"/>
+        <w:spacing w:after="100" w:before="280"/>
       </w:pPr>
       <w:r>
         <w:rPr>
@@ -2302,7 +3395,7 @@
     </w:p>
     <w:p>
       <w:pPr>
-        <w:spacing w:after="80" w:before="80"/>
+        <w:spacing w:after="60" w:before="60"/>
         <w:ind w:left="720"/>
         <w:jc w:val="both"/>
       </w:pPr>
@@ -2311,12 +3404,12 @@
           <w:sz w:val="22"/>
           <w:szCs w:val="22"/>
         </w:rPr>
-        <w:t xml:space="preserve">PRIMERO: Tener por presentada la demanda en la vía ordinaria civil.</w:t>
-      </w:r>
-    </w:p>
-    <w:p>
-      <w:pPr>
-        <w:spacing w:after="80" w:before="80"/>
+        <w:t xml:space="preserve">PRIMERO: Tener por presentada la demanda en vía ordinaria civil.</w:t>
+      </w:r>
+    </w:p>
+    <w:p>
+      <w:pPr>
+        <w:spacing w:after="60" w:before="60"/>
         <w:ind w:left="720"/>
         <w:jc w:val="both"/>
       </w:pPr>
@@ -2325,12 +3418,12 @@
           <w:sz w:val="22"/>
           <w:szCs w:val="22"/>
         </w:rPr>
-        <w:t xml:space="preserve">SEGUNDO: Admitirla y ordenar el emplazamiento al Salón Extravaganza.</w:t>
-      </w:r>
-    </w:p>
-    <w:p>
-      <w:pPr>
-        <w:spacing w:after="80" w:before="80"/>
+        <w:t xml:space="preserve">SEGUNDO: Admitirla y emplazar a Salón Extravaganza.</w:t>
+      </w:r>
+    </w:p>
+    <w:p>
+      <w:pPr>
+        <w:spacing w:after="60" w:before="60"/>
         <w:ind w:left="720"/>
         <w:jc w:val="both"/>
       </w:pPr>
@@ -2356,7 +3449,7 @@
     </w:p>
     <w:p>
       <w:pPr>
-        <w:spacing w:after="80" w:before="80"/>
+        <w:spacing w:after="60" w:before="60"/>
         <w:ind/>
         <w:jc w:val="both"/>
       </w:pPr>
@@ -2394,7 +3487,7 @@
     </w:p>
     <w:p>
       <w:pPr>
-        <w:spacing w:after="80" w:before="80"/>
+        <w:spacing w:after="60" w:before="60"/>
         <w:ind/>
         <w:jc w:val="both"/>
       </w:pPr>
@@ -2462,8 +3555,8 @@
         <w:rPr>
           <w:b/>
           <w:bCs/>
-          <w:sz w:val="24"/>
-          <w:szCs w:val="24"/>
+          <w:sz w:val="22"/>
+          <w:szCs w:val="22"/>
         </w:rPr>
         <w:t xml:space="preserve">ARTURO CRUZ</w:t>
       </w:r>
@@ -2503,7 +3596,7 @@
         <w:pBdr>
           <w:bottom w:val="single" w:color="1a3a5c" w:sz="6"/>
         </w:pBdr>
-        <w:spacing w:after="200" w:before="400"/>
+        <w:spacing w:after="180" w:before="400"/>
       </w:pPr>
       <w:r>
         <w:rPr>
@@ -2518,7 +3611,7 @@
     </w:p>
     <w:p>
       <w:pPr>
-        <w:spacing w:after="120" w:before="280"/>
+        <w:spacing w:after="100" w:before="280"/>
       </w:pPr>
       <w:r>
         <w:rPr>
@@ -2528,12 +3621,12 @@
           <w:sz w:val="24"/>
           <w:szCs w:val="24"/>
         </w:rPr>
-        <w:t xml:space="preserve">A) Demanda Civil</w:t>
-      </w:r>
-    </w:p>
-    <w:p>
-      <w:pPr>
-        <w:spacing w:after="80" w:before="80"/>
+        <w:t xml:space="preserve">Demanda Civil</w:t>
+      </w:r>
+    </w:p>
+    <w:p>
+      <w:pPr>
+        <w:spacing w:after="60" w:before="60"/>
         <w:ind/>
         <w:jc w:val="both"/>
       </w:pPr>
@@ -2547,7 +3640,7 @@
     </w:p>
     <w:p>
       <w:pPr>
-        <w:spacing w:after="80" w:before="80"/>
+        <w:spacing w:after="60" w:before="60"/>
         <w:ind/>
         <w:jc w:val="both"/>
       </w:pPr>
@@ -2556,7 +3649,21 @@
           <w:sz w:val="22"/>
           <w:szCs w:val="22"/>
         </w:rPr>
-        <w:t xml:space="preserve">Tel: 473 735 22 00  |  Horario: Lun–Vie 8:00–15:00 hrs</w:t>
+        <w:t xml:space="preserve">Tel: 473 735 22 00  |  Lun–Vie 8:00–15:00 hrs</w:t>
+      </w:r>
+    </w:p>
+    <w:p>
+      <w:pPr>
+        <w:spacing w:after="60" w:before="60"/>
+        <w:ind/>
+        <w:jc w:val="both"/>
+      </w:pPr>
+      <w:r>
+        <w:rPr>
+          <w:sz w:val="22"/>
+          <w:szCs w:val="22"/>
+        </w:rPr>
+        <w:t xml:space="preserve">Defensoría Pública gratuita: 800 000 1700</w:t>
       </w:r>
     </w:p>
     <w:p>
@@ -2573,89 +3680,7 @@
     </w:p>
     <w:p>
       <w:pPr>
-        <w:spacing w:after="80" w:before="80"/>
-        <w:ind w:left="720"/>
-        <w:jc w:val="both"/>
-      </w:pPr>
-      <w:r>
-        <w:rPr>
-          <w:sz w:val="22"/>
-          <w:szCs w:val="22"/>
-        </w:rPr>
-        <w:t xml:space="preserve">1. Ir a ventanilla de orientación jurídica.</w:t>
-      </w:r>
-    </w:p>
-    <w:p>
-      <w:pPr>
-        <w:spacing w:after="80" w:before="80"/>
-        <w:ind w:left="720"/>
-        <w:jc w:val="both"/>
-      </w:pPr>
-      <w:r>
-        <w:rPr>
-          <w:sz w:val="22"/>
-          <w:szCs w:val="22"/>
-        </w:rPr>
-        <w:t xml:space="preserve">2. Preguntar si aplica juicio oral civil (más rápido, menos de $150,000 MXN).</w:t>
-      </w:r>
-    </w:p>
-    <w:p>
-      <w:pPr>
-        <w:spacing w:after="80" w:before="80"/>
-        <w:ind w:left="720"/>
-        <w:jc w:val="both"/>
-      </w:pPr>
-      <w:r>
-        <w:rPr>
-          <w:sz w:val="22"/>
-          <w:szCs w:val="22"/>
-        </w:rPr>
-        <w:t xml:space="preserve">3. Presentar escrito de demanda en 3 tantos con todos los anexos del checklist.</w:t>
-      </w:r>
-    </w:p>
-    <w:p>
-      <w:pPr>
-        <w:spacing w:after="80" w:before="80"/>
-        <w:ind w:left="720"/>
-        <w:jc w:val="both"/>
-      </w:pPr>
-      <w:r>
-        <w:rPr>
-          <w:sz w:val="22"/>
-          <w:szCs w:val="22"/>
-        </w:rPr>
-        <w:t xml:space="preserve">4. Pagar derechos en caja. Conservar acuse sellado.</w:t>
-      </w:r>
-    </w:p>
-    <w:p>
-      <w:pPr>
-        <w:spacing w:after="80" w:before="80"/>
-        <w:ind w:left="720"/>
-        <w:jc w:val="both"/>
-      </w:pPr>
-      <w:r>
-        <w:rPr>
-          <w:sz w:val="22"/>
-          <w:szCs w:val="22"/>
-        </w:rPr>
-        <w:t xml:space="preserve">5. Defensoría Pública gratuita: 800 000 1700 (pueden revisar tu demanda sin costo).</w:t>
-      </w:r>
-    </w:p>
-    <w:p>
-      <w:pPr>
-        <w:spacing w:after="80" w:before="80"/>
-      </w:pPr>
-      <w:r>
-        <w:rPr>
-          <w:sz w:val="22"/>
-          <w:szCs w:val="22"/>
-        </w:rPr>
-        <w:t xml:space="preserve"/>
-      </w:r>
-    </w:p>
-    <w:p>
-      <w:pPr>
-        <w:spacing w:after="120" w:before="280"/>
+        <w:spacing w:after="100" w:before="280"/>
       </w:pPr>
       <w:r>
         <w:rPr>
@@ -2665,12 +3690,12 @@
           <w:sz w:val="24"/>
           <w:szCs w:val="24"/>
         </w:rPr>
-        <w:t xml:space="preserve">B) Queja PROFECO (primer paso recomendado, gratuito)</w:t>
-      </w:r>
-    </w:p>
-    <w:p>
-      <w:pPr>
-        <w:spacing w:after="80" w:before="80"/>
+        <w:t xml:space="preserve">Queja PROFECO (primer paso, gratuito)</w:t>
+      </w:r>
+    </w:p>
+    <w:p>
+      <w:pPr>
+        <w:spacing w:after="60" w:before="60"/>
         <w:ind/>
         <w:jc w:val="both"/>
       </w:pPr>
@@ -2684,7 +3709,7 @@
     </w:p>
     <w:p>
       <w:pPr>
-        <w:spacing w:after="80" w:before="80"/>
+        <w:spacing w:after="60" w:before="60"/>
         <w:ind/>
         <w:jc w:val="both"/>
       </w:pPr>
@@ -2710,7 +3735,7 @@
     </w:p>
     <w:p>
       <w:pPr>
-        <w:spacing w:after="120" w:before="280"/>
+        <w:spacing w:after="100" w:before="280"/>
       </w:pPr>
       <w:r>
         <w:rPr>
@@ -2720,12 +3745,12 @@
           <w:sz w:val="24"/>
           <w:szCs w:val="24"/>
         </w:rPr>
-        <w:t xml:space="preserve">C) Denuncia Protección Civil</w:t>
-      </w:r>
-    </w:p>
-    <w:p>
-      <w:pPr>
-        <w:spacing w:after="80" w:before="80"/>
+        <w:t xml:space="preserve">Denuncia Protección Civil</w:t>
+      </w:r>
+    </w:p>
+    <w:p>
+      <w:pPr>
+        <w:spacing w:after="60" w:before="60"/>
         <w:ind/>
         <w:jc w:val="both"/>
       </w:pPr>
@@ -2734,26 +3759,12 @@
           <w:sz w:val="22"/>
           <w:szCs w:val="22"/>
         </w:rPr>
-        <w:t xml:space="preserve">C. 16 de Septiembre 738, León, Gto.</w:t>
+        <w:t xml:space="preserve">C. 16 de Septiembre 738, León, Gto.  |  Tel: 477 763 59 16</w:t>
       </w:r>
     </w:p>
     <w:p>
       <w:pPr>
         <w:spacing w:after="80" w:before="80"/>
-        <w:ind/>
-        <w:jc w:val="both"/>
-      </w:pPr>
-      <w:r>
-        <w:rPr>
-          <w:sz w:val="22"/>
-          <w:szCs w:val="22"/>
-        </w:rPr>
-        <w:t xml:space="preserve">Tel: 477 763 59 16</w:t>
-      </w:r>
-    </w:p>
-    <w:p>
-      <w:pPr>
-        <w:spacing w:after="80" w:before="80"/>
       </w:pPr>
       <w:r>
         <w:rPr>
@@ -2765,22 +3776,7 @@
     </w:p>
     <w:p>
       <w:pPr>
-        <w:spacing w:after="120" w:before="280"/>
-      </w:pPr>
-      <w:r>
-        <w:rPr>
-          <w:b/>
-          <w:bCs/>
-          <w:color w:val="2c5f8a"/>
-          <w:sz w:val="24"/>
-          <w:szCs w:val="24"/>
-        </w:rPr>
-        <w:t xml:space="preserve">Sitio web del caso (expediente público)</w:t>
-      </w:r>
-    </w:p>
-    <w:p>
-      <w:pPr>
-        <w:spacing w:after="200" w:before="200"/>
+        <w:spacing w:after="100" w:before="200"/>
         <w:jc w:val="center"/>
       </w:pPr>
       <w:r>
@@ -2796,7 +3792,7 @@
     </w:p>
     <w:p>
       <w:pPr>
-        <w:spacing w:after="80" w:before="80"/>
+        <w:spacing w:after="60" w:before="60"/>
         <w:ind/>
         <w:jc w:val="center"/>
       </w:pPr>
@@ -2808,7 +3804,7 @@
           <w:sz w:val="22"/>
           <w:szCs w:val="22"/>
         </w:rPr>
-        <w:t xml:space="preserve">Contiene: todas las evidencias fotográficas, cronología, fundamento legal y documentos descargables.</w:t>
+        <w:t xml:space="preserve">Expediente público completo con evidencias, cronología y documentos descargables.</w:t>
       </w:r>
     </w:p>
     <w:sectPr>

</xml_diff>